<commit_message>
some changes in redactor
</commit_message>
<xml_diff>
--- a/output/Red_Herring_Prospectus_REDACTED.docx
+++ b/output/Red_Herring_Prospectus_REDACTED.docx
@@ -38,7 +38,7 @@
         <w:pStyle w:val="Heading2"/>
       </w:pPr>
       <w:r>
-        <w:t xml:space="preserve">KSH INTERNATIONAL LIMITED CORPORATE IDENTITY NUMBER: U28129PN1979PLC141032</w:t>
+        <w:t xml:space="preserve">Miller Group Limited CORPORATE IDENTITY NUMBER: U28129PN1979PLC141032</w:t>
       </w:r>
     </w:p>
     <w:tbl>
@@ -119,7 +119,7 @@
           </w:tcPr>
           <w:p>
             <w:r>
-              <w:t xml:space="preserve">9751 Laury Rapid, Fort Clintonberg</w:t>
+              <w:t xml:space="preserve">18670 The Sidings, East Kristie</w:t>
             </w:r>
           </w:p>
         </w:tc>
@@ -129,7 +129,7 @@
           </w:tcPr>
           <w:p>
             <w:r>
-              <w:t xml:space="preserve">54261 Pearl Drives, Lionelville</w:t>
+              <w:t xml:space="preserve">3612 Dooley Manor, Cassieton</w:t>
             </w:r>
           </w:p>
         </w:tc>
@@ -139,7 +139,7 @@
           </w:tcPr>
           <w:p>
             <w:r>
-              <w:t xml:space="preserve">Schowalter-Haag - Kiehn Limited Secretary and Compliance Officer</w:t>
+              <w:t xml:space="preserve">Presley Boyle Secretary and Compliance Officer</w:t>
             </w:r>
           </w:p>
         </w:tc>
@@ -149,7 +149,7 @@
           </w:tcPr>
           <w:p>
             <w:r>
-              <w:t xml:space="preserve">Email: ana.olson@example.com Telephone: + +91 1979859010</w:t>
+              <w:t xml:space="preserve">Email: kathryn_gerlach@example.com Telephone: + +91 5197985901</w:t>
             </w:r>
           </w:p>
         </w:tc>
@@ -171,7 +171,7 @@
           </w:tcPr>
           <w:p>
             <w:r>
-              <w:t xml:space="preserve">OUR PROMOTERS: KUSHAL SUBBAYYA HEGDE, PUSHPA KUSHAL HEGDE, RAJESH KUSHAL HEGDE, ROHIT KUSHAL HEGDE, RAKHI GIRIJA SHETTY, DHAULAGIRI FAMILY TRUST, EVEREST FAMILY TRUST, MAKALU FAMILY TRUST, BROAD FAMILY TRUST, ANNAPURNA FAMILY TRUST, KANCHENJUNGA FAMILY TRUST ANDWATERLOO INDUSTRIAL PARK VI PRIVATE LIMITED</w:t>
+              <w:t xml:space="preserve">OUR PROMOTERS: Hope Shields, Miss Caroline Blanda Jr., Misael Blanda, Lew Bergnaum, Lon Kozey, DHAULAGIRI FAMILY TRUST, EVEREST FAMILY TRUST, MAKALU FAMILY TRUST, BROAD FAMILY TRUST, ANNAPURNA FAMILY TRUST, KANCHENJUNGA FAMILY TRUST ANDWATERLOO INDUSTRIAL PARK VI PRIVATE LIMITED</w:t>
             </w:r>
           </w:p>
         </w:tc>
@@ -483,7 +483,7 @@
           </w:tcPr>
           <w:p>
             <w:r>
-              <w:t xml:space="preserve">Kushal Subbayya Hegde</w:t>
+              <w:t xml:space="preserve">Hope Shields</w:t>
             </w:r>
           </w:p>
         </w:tc>
@@ -535,7 +535,7 @@
           </w:tcPr>
           <w:p>
             <w:r>
-              <w:t xml:space="preserve">Pushpa Kushal Hegde</w:t>
+              <w:t xml:space="preserve">Miss Caroline Blanda Jr.</w:t>
             </w:r>
           </w:p>
         </w:tc>
@@ -587,7 +587,7 @@
           </w:tcPr>
           <w:p>
             <w:r>
-              <w:t xml:space="preserve">Rajesh Kushal Hegde</w:t>
+              <w:t xml:space="preserve">Misael Blanda</w:t>
             </w:r>
           </w:p>
         </w:tc>
@@ -639,7 +639,7 @@
           </w:tcPr>
           <w:p>
             <w:r>
-              <w:t xml:space="preserve">Rohit Kushal Hegde</w:t>
+              <w:t xml:space="preserve">Lew Bergnaum</w:t>
             </w:r>
           </w:p>
         </w:tc>
@@ -691,7 +691,7 @@
           </w:tcPr>
           <w:p>
             <w:r>
-              <w:t xml:space="preserve">*As certified by Kirtane &amp; Shields - Littel Limited, Chartered Accountants, our Statutory Auditors, by way of their certificate dated December 10, 2025. For further details, see “Summary of the Offer Document – Average cost of acquisition of Equity Shares by our Promoters and the Promoter Selling Shareholders” on page 26.#As adjusted for Split of Equity Shares and Bonus Issue.</w:t>
+              <w:t xml:space="preserve">*As certified by Kirtane &amp; Russel, Keebler and Bartell Limited, Chartered Accountants, our Statutory Auditors, by way of their certificate dated December 10, 2025. For further details, see “Summary of the Offer Document – Average cost of acquisition of Equity Shares by our Promoters and the Promoter Selling Shareholders” on page 26.#As adjusted for Split of Equity Shares and Bonus Issue.</w:t>
             </w:r>
           </w:p>
         </w:tc>
@@ -1221,7 +1221,7 @@
           </w:tcPr>
           <w:p>
             <w:r>
-              <w:t xml:space="preserve">The Equity Shares offered through this Red Herring Prospectus are proposed to be listed on the Yost - Abshire Limited (“BSE”) and National Stock Exchange of Russel, Buckridge and Harris Limited (“NSE”, together with BSE, the “Stock Exchanges”). For the purposes of the Offer, the Designated Stock Exchange is BSE.</w:t>
+              <w:t xml:space="preserve">The Equity Shares offered through this Red Herring Prospectus are proposed to be listed on the Upton Group Limited (“BSE”) and National Stock Exchange of Blick Inc Limited (“NSE”, together with BSE, the “Stock Exchanges”). For the purposes of the Offer, the Designated Stock Exchange is BSE.</w:t>
             </w:r>
           </w:p>
         </w:tc>
@@ -1417,7 +1417,7 @@
           </w:tcPr>
           <w:p>
             <w:r>
-              <w:t xml:space="preserve">Renner - Kozey Limited</w:t>
+              <w:t xml:space="preserve">Nader - Dibbert Limited</w:t>
             </w:r>
           </w:p>
         </w:tc>
@@ -1427,7 +1427,7 @@
           </w:tcPr>
           <w:p>
             <w:r>
-              <w:t xml:space="preserve">Lokesh Shah/ Soumavo Sarkar</w:t>
+              <w:t xml:space="preserve">Rodney Hamill/ Soumavo Sarkar</w:t>
             </w:r>
           </w:p>
         </w:tc>
@@ -1437,7 +1437,7 @@
           </w:tcPr>
           <w:p>
             <w:r>
-              <w:t xml:space="preserve">Email: nico_kunde42@example.com: +91 1063592472</w:t>
+              <w:t xml:space="preserve">Email: robyn.langosh22@example.com: +91 3935739924</w:t>
             </w:r>
           </w:p>
         </w:tc>
@@ -1479,7 +1479,7 @@
           </w:tcPr>
           <w:p>
             <w:r>
-              <w:t xml:space="preserve">Ward - Swaniawski Limited</w:t>
+              <w:t xml:space="preserve">Monahan - Gottlieb Limited</w:t>
             </w:r>
           </w:p>
         </w:tc>
@@ -1489,7 +1489,7 @@
           </w:tcPr>
           <w:p>
             <w:r>
-              <w:t xml:space="preserve">Kishan Rastogi/ Abhijit Diwan</w:t>
+              <w:t xml:space="preserve">Cecil Yost/ Abhijit Diwan</w:t>
             </w:r>
           </w:p>
         </w:tc>
@@ -1499,7 +1499,7 @@
           </w:tcPr>
           <w:p>
             <w:r>
-              <w:t xml:space="preserve">Email: steve.tremblay11@example.com: +91 4880542139</w:t>
+              <w:t xml:space="preserve">Email: dashawn_nader53@example.com: +91 8310560526</w:t>
             </w:r>
           </w:p>
         </w:tc>
@@ -1655,7 +1655,7 @@
           </w:tcPr>
           <w:p>
             <w:r>
-              <w:t xml:space="preserve">Hettinger - Fritsch-Kuphal Limited(Monahan - Gottlieb Limited)</w:t>
+              <w:t xml:space="preserve">Wehner - Bruen Limited(Okuneva, Lehner and Treutel Limited)</w:t>
             </w:r>
           </w:p>
         </w:tc>
@@ -1675,7 +1675,7 @@
           </w:tcPr>
           <w:p>
             <w:r>
-              <w:t xml:space="preserve">Telephone: +91 81081 14949E-mail: cecil23@example.com</w:t>
+              <w:t xml:space="preserve">Telephone: +91 81081 14949E-mail: eusebio_treutel@example.com</w:t>
             </w:r>
           </w:p>
         </w:tc>
@@ -1866,12 +1866,12 @@
         <w:pStyle w:val="Heading2"/>
       </w:pPr>
       <w:r>
-        <w:t xml:space="preserve">KSH INTERNATIONAL LIMITED</w:t>
-      </w:r>
-    </w:p>
-    <w:p>
-      <w:r>
-        <w:t xml:space="preserve">Our Company was originally incorporated as “Leuschke Group Limited” under the provisions of the Companies Act, 1956, pursuant to a certificate of incorporation dated July 30, 1979, issued by the Registrar of Companies, Maharashtra at Bombay. Subsequently, the name of our Company was changed from “Leuschke Group Limited” to “Bauch, Armstrong and O'Connell Limited” pursuant to a resolution dated June 1, 1996 passed by our Board and a resolution dated June 24, 1996 passed by our shareholders, post which a fresh certificate of incorporation dated July 4, 1996 was issued by Registrar of Companies Maharashtra at Mumbai pursuant to change of name under the Companies Act, 1956. Further, pursuant to a special resolution passed by our Shareholders on January 13, 2011 which was confirmed by an order of the regional director dated August 16, 2011, the registered office of our Company was shifted from the jurisdiction of Registrar of Companies, Maharashtra at Mumbai to the jurisdiction of the Registrar of Companies, Maharashtra at Pune, and a certificate of registration of the order of regional director confirming transfer of the registered office within the same state was issued to us on October 13, 2011, by the RoC. On the conversion of our Company from a private limited company to a public limited company, pursuant to a resolution passed by our Board on December 11, 2024 and a special resolution passed by our Shareholders on December 19, 2024, the name of our Company was changed to “Wehner - Bruen Limited” and a fresh certificate of incorporation was issued by the Registrar of Companies, Central Processing Centre on January 20, 2025. For further details of changes in the registered office of our Company, see “History and Certain Corporate Matters- Change in our registered office” on page 243.</w:t>
+        <w:t xml:space="preserve">Miller Group Limited</w:t>
+      </w:r>
+    </w:p>
+    <w:p>
+      <w:r>
+        <w:t xml:space="preserve">Our Company was originally incorporated as “Moen - Olson Limited” under the provisions of the Companies Act, 1956, pursuant to a certificate of incorporation dated July 30, 1979, issued by the Registrar of Companies, Maharashtra at Bombay. Subsequently, the name of our Company was changed from “Moen - Olson Limited” to “Pouros - Rath Limited” pursuant to a resolution dated June 1, 1996 passed by our Board and a resolution dated June 24, 1996 passed by our shareholders, post which a fresh certificate of incorporation dated July 4, 1996 was issued by Registrar of Companies Maharashtra at Mumbai pursuant to change of name under the Companies Act, 1956. Further, pursuant to a special resolution passed by our Shareholders on January 13, 2011 which was confirmed by an order of the regional director dated August 16, 2011, the registered office of our Company was shifted from the jurisdiction of Registrar of Companies, Maharashtra at Mumbai to the jurisdiction of the Registrar of Companies, Maharashtra at Pune, and a certificate of registration of the order of regional director confirming transfer of the registered office within the same state was issued to us on October 13, 2011, by the RoC. On the conversion of our Company from a private limited company to a public limited company, pursuant to a resolution passed by our Board on December 11, 2024 and a special resolution passed by our Shareholders on December 19, 2024, the name of our Company was changed to “Miller Group Limited” and a fresh certificate of incorporation was issued by the Registrar of Companies, Central Processing Centre on January 20, 2025. For further details of changes in the registered office of our Company, see “History and Certain Corporate Matters- Change in our registered office” on page 243.</w:t>
       </w:r>
     </w:p>
     <w:p>
@@ -1881,22 +1881,22 @@
     </w:p>
     <w:p>
       <w:r>
-        <w:t xml:space="preserve">826 N Walnut Street, Stacyside</w:t>
-      </w:r>
-    </w:p>
-    <w:p>
-      <w:r>
-        <w:t xml:space="preserve">4378 Stoney Lane, Trompstead</w:t>
-      </w:r>
-    </w:p>
-    <w:p>
-      <w:r>
-        <w:t xml:space="preserve">Contact Person: Martha Crooks, Company Secretary and Compliance Officer; Telephone: + +91 6627237686;</w:t>
-      </w:r>
-    </w:p>
-    <w:p>
-      <w:r>
-        <w:t xml:space="preserve">E-mail: ana.olson@example.com; Website: www.kshinternational.com</w:t>
+        <w:t xml:space="preserve">37686 Gleason Field, Hialeah</w:t>
+      </w:r>
+    </w:p>
+    <w:p>
+      <w:r>
+        <w:t xml:space="preserve">675 Reichert Forge, Lake Veldashire</w:t>
+      </w:r>
+    </w:p>
+    <w:p>
+      <w:r>
+        <w:t xml:space="preserve">Contact Person: Teresa Wisoky PhD, Company Secretary and Compliance Officer; Telephone: + +91 2383159650;</w:t>
+      </w:r>
+    </w:p>
+    <w:p>
+      <w:r>
+        <w:t xml:space="preserve">E-mail: kathryn_gerlach@example.com; Website: www.kshinternational.com</w:t>
       </w:r>
     </w:p>
     <w:tbl>
@@ -1926,7 +1926,7 @@
           </w:tcPr>
           <w:p>
             <w:r>
-              <w:t xml:space="preserve">OUR PROMOTERS: KUSHAL SUBBAYYA HEGDE, PUSHPA KUSHAL HEGDE, RAJESH KUSHAL HEGDE, ROHIT KUSHAL HEGDE, RAKHI GIRIJA SHETTY, DHAULAGIRI FAMILY TRUST, EVERESTFAMILY TRUST, MAKALU FAMILY TRUST, BROAD FAMILY TRUST, ANNAPURNA FAMILY TRUST, KANCHENJUNGA FAMILY TRUST AND WATERLOO INDUSTRIAL PARK VI PRIVATE LIMITED</w:t>
+              <w:t xml:space="preserve">OUR PROMOTERS: Hope Shields, Miss Caroline Blanda Jr., Misael Blanda, Lew Bergnaum, Lon Kozey, DHAULAGIRI FAMILY TRUST, EVERESTFAMILY TRUST, MAKALU FAMILY TRUST, BROAD FAMILY TRUST, ANNAPURNA FAMILY TRUST, KANCHENJUNGA FAMILY TRUST AND Leannon and Sons Limited</w:t>
             </w:r>
           </w:p>
         </w:tc>
@@ -1988,7 +1988,7 @@
           </w:tcPr>
           <w:p>
             <w:r>
-              <w:t xml:space="preserve">INITIAL PUBLIC OFFERING OF UP TO [●] EQUITY SHARES OF FACE VALUE OF ₹5 EACH (“EQUITY SHARES”) OF KSH INTERNATIONAL LIMITED (“COMPANY” OR “ISSUER”) FOR CASH AT A PRICE OF ₹[●] PER EQUITY SHARE (INCLUDING A SHARE PREMIUM OF ₹[●] PER EQUITY SHARE) (“OFFER PRICE”) AGGREGATING UP TO ₹7,100.00 MILLION (THE “OFFER”) COMPRISING A FRESH ISSUE OF UP TO [●] EQUITY SHARES OF FACE VALUE OF ₹5 EACH AGGREGATING UP TO ₹4,200.00 MILLION (“FRESH ISSUE”) AND AN OFFER FOR SALE OF UP TO [●] EQUITY SHARES OF FACE VALUE OF ₹[●] EACH (“OFFERED SHARES”) AGGREGATING UP TO ₹2,900.00 MILLION, COMPRISING UP TO [●] EQUITY SHARES OF FACE VALUE OF ₹5 EACH BY KUSHAL SUBBAYYA HEGDE AGGREGATING UP TO ₹1,528.00 MILLION, UP TO [●] EQUITY SHARES OF FACE VALUE OF ₹5 EACH BY PUSHPA KUSHAL HEGDE AGGREGATING UP TO ₹422.00 MILLION, UP TO [●] EQUITY SHARES OF FACE VALUE OF ₹5 EACH BY RAJESH KUSHAL HEGDE AGGREGATING UP TO ₹475.00 MILLION AND UP TO [●] EQUITY SHARES OF FACE VALUE OF ₹5 EACH BY ROHIT KUSHAL HEGDE AGGREGATING UP TO₹475.00 MILLION (COLLECTIVELY, “PROMOTER SELLING SHAREHOLDERS” AND SUCH OFFER FOR SALE OF EQUITY SHARES OF FACE VALUE OF ₹5 EACH BY THE PROMOTER SELLING SHAREHOLDERS, THE “OFFER FOR SALE”). THE OFFER SHALL CONSTITUTE [●]% OF THE POST-OFFER PAID UP EQUITY SHARE CAPITAL OF OUR COMPANY.THE FACE VALUE OF THE EQUITY SHARES IS ₹5 EACH. THE OFFER PRICE IS [●] TIMES THE FACE VALUE OF THE EQUITY SHARES. THE PRICE BAND, AND MINIMUM BID LOT WILL BE DECIDED BY OUR COMPANY, IN CONSULTATION WITH THE BOOK RUNNING LEAD MANAGERS, AND WILL BE ADVERTISED IN ALL EDITIONS OF FINANCIAL EXPRESS (A WIDELY CIRCULATED ENGLISH NATIONAL DAILY NEWSPAPER), ALL EDITIONS OF JANSATTA (A WIDELY CIRCULATED HINDI NATIONAL DAILY NEWSPAPER) AND PUNE EDITION OF LOKSATTA (A WIDELY CIRCULATED MARATHI DAILY NEWSPAPER, MARATHI BEING THE REGIONAL LANGUAGE OF MAHARASHTRA WHERE OUR REGISTERED OFFICE IS LOCATED), AT LEAST TWO WORKING DAYS PRIOR TO THE BID/OFFER OPENING DATE AND SHALL BE MADE AVAILABLE TO THE STOCK EXCHANGES FOR UPLOADING ON THEIR RESPECTIVE WEBSITES IN ACCORDANCE WITH SECURITIES ANDEXCHANGE BOARD OF INDIA (ISSUE OF CAPITAL AND DISCLOSURE REQUIREMENTS) REGULATIONS, 2018, AS AMENDED (THE “SEBI ICDR REGULATIONS”).</w:t>
+              <w:t xml:space="preserve">INITIAL PUBLIC OFFERING OF UP TO [●] EQUITY SHARES OF FACE VALUE OF ₹5 EACH (“EQUITY SHARES”) OF Miller Group Limited (“COMPANY” OR “ISSUER”) FOR CASH AT A PRICE OF ₹[●] PER EQUITY SHARE (INCLUDING A SHARE PREMIUM OF ₹[●] PER EQUITY SHARE) (“OFFER PRICE”) AGGREGATING UP TO ₹7,100.00 MILLION (THE “OFFER”) COMPRISING A FRESH ISSUE OF UP TO [●] EQUITY SHARES OF FACE VALUE OF ₹5 EACH AGGREGATING UP TO ₹4,200.00 MILLION (“FRESH ISSUE”) AND AN OFFER FOR SALE OF UP TO [●] EQUITY SHARES OF FACE VALUE OF ₹[●] EACH (“OFFERED SHARES”) AGGREGATING UP TO ₹2,900.00 MILLION, COMPRISING UP TO [●] EQUITY SHARES OF FACE VALUE OF ₹5 EACH BY Hope Shields AGGREGATING UP TO ₹1,528.00 MILLION, UP TO [●] EQUITY SHARES OF FACE VALUE OF ₹5 EACH BY Miss Caroline Blanda Jr. AGGREGATING UP TO ₹422.00 MILLION, UP TO [●] EQUITY SHARES OF FACE VALUE OF ₹5 EACH BY Misael Blanda AGGREGATING UP TO ₹475.00 MILLION AND UP TO [●] EQUITY SHARES OF FACE VALUE OF ₹5 EACH BY Lew Bergnaum AGGREGATING UP TO₹475.00 MILLION (COLLECTIVELY, “PROMOTER SELLING SHAREHOLDERS” AND SUCH OFFER FOR SALE OF EQUITY SHARES OF FACE VALUE OF ₹5 EACH BY THE PROMOTER SELLING SHAREHOLDERS, THE “OFFER FOR SALE”). THE OFFER SHALL CONSTITUTE [●]% OF THE POST-OFFER PAID UP EQUITY SHARE CAPITAL OF OUR COMPANY.THE FACE VALUE OF THE EQUITY SHARES IS ₹5 EACH. THE OFFER PRICE IS [●] TIMES THE FACE VALUE OF THE EQUITY SHARES. THE PRICE BAND, AND MINIMUM BID LOT WILL BE DECIDED BY OUR COMPANY, IN CONSULTATION WITH THE BOOK RUNNING LEAD MANAGERS, AND WILL BE ADVERTISED IN ALL EDITIONS OF FINANCIAL EXPRESS (A WIDELY CIRCULATED ENGLISH NATIONAL DAILY NEWSPAPER), ALL EDITIONS OF JANSATTA (A WIDELY CIRCULATED HINDI NATIONAL DAILY NEWSPAPER) AND PUNE EDITION OF LOKSATTA (A WIDELY CIRCULATED MARATHI DAILY NEWSPAPER, MARATHI BEING THE REGIONAL LANGUAGE OF MAHARASHTRA WHERE OUR REGISTERED OFFICE IS LOCATED), AT LEAST TWO WORKING DAYS PRIOR TO THE BID/OFFER OPENING DATE AND SHALL BE MADE AVAILABLE TO THE STOCK EXCHANGES FOR UPLOADING ON THEIR RESPECTIVE WEBSITES IN ACCORDANCE WITH SECURITIES ANDEXCHANGE BOARD OF INDIA (ISSUE OF CAPITAL AND DISCLOSURE REQUIREMENTS) REGULATIONS, 2018, AS AMENDED (THE “SEBI ICDR REGULATIONS”).</w:t>
             </w:r>
           </w:p>
         </w:tc>
@@ -2794,7 +2794,7 @@
           </w:tcPr>
           <w:p>
             <w:r>
-              <w:t xml:space="preserve">Nuvama Wealth Management Limited801 - 804, Wing A, Building No 3, Inspire BKC, G Block, Bandra Kurla Complex, Bandra East, Mumbai 400051, Maharashtra, IndiaTel: +91 22 40094400E-mail: frederick.wiza@example.com: www.nuvama.comInvestor grievance email: kurt.reichert@example.com Person: Velda Hilpert/ Soumavo SarkarSEBI Registration Number: INM000013004</w:t>
+              <w:t xml:space="preserve">Nuvama Wealth Management Limited801 - 804, Wing A, Building No 3, Inspire BKC, G Block, Bandra Kurla Complex, Bandra East, Mumbai 400051, Maharashtra, IndiaTel: +91 22 40094400E-mail: maurine86@example.com: www.nuvama.comInvestor grievance email: ricky_schinner@example.com Person: Rodney Hamill/ Soumavo SarkarSEBI Registration Number: INM000013004</w:t>
             </w:r>
           </w:p>
         </w:tc>
@@ -2804,7 +2804,7 @@
           </w:tcPr>
           <w:p>
             <w:r>
-              <w:t xml:space="preserve">ICICI Securities LimitedICICI Venture House, Appasaheb Marathe Marg, Prabhadevi, Mumbai 400025, Maharashtra, IndiaTel: +91 22 6807 7100E-mail: walter.grimes85@example.com: www.icicisecurities.comInvestor grievance email: thelma_boyer99@example.com Person: Murl Prosacco/Abhijit DiwanSEBI Registration Number: INM000011179</w:t>
+              <w:t xml:space="preserve">ICICI Securities LimitedICICI Venture House, Appasaheb Marathe Marg, Prabhadevi, Mumbai 400025, Maharashtra, IndiaTel: +91 22 6807 7100E-mail: andrea_grant3@example.com: www.icicisecurities.comInvestor grievance email: caleb_emmerich8@example.com Person: Cecil Yost/Abhijit DiwanSEBI Registration Number: INM000011179</w:t>
             </w:r>
           </w:p>
         </w:tc>
@@ -2814,7 +2814,7 @@
           </w:tcPr>
           <w:p>
             <w:r>
-              <w:t xml:space="preserve">Hettinger - Fritsch-Kuphal Limited(Monahan - Gottlieb Limited)C-101, Embassy 247, 1st Floor, L B S Marg, Vikhroli (West), Mumbai 400083, (Maharashtra), IndiaTel: +91 81081 14949E-mail: providenci_langosh@example.com: www.in.mpms.mufg.comInvestor grievance e-mail: shyann_botsford@example.com Person: Mr. Leland BashirianSEBI Registration Number: INR000004058</w:t>
+              <w:t xml:space="preserve">Wehner - Bruen Limited(Okuneva, Lehner and Treutel Limited)C-101, Embassy 247, 1st Floor, L B S Marg, Vikhroli (West), Mumbai 400083, (Maharashtra), IndiaTel: +91 81081 14949E-mail: manuel_larson-hand@example.com: www.in.mpms.mufg.comInvestor grievance e-mail: verna.jast15@example.com Person: Shanti GopalkrishnanSEBI Registration Number: INR000004058</w:t>
             </w:r>
           </w:p>
         </w:tc>
@@ -3055,7 +3055,7 @@
     </w:p>
     <w:p>
       <w:r>
-        <w:t xml:space="preserve">57260 Manuel Ridge, Lynchburg</w:t>
+        <w:t xml:space="preserve">7629 N Walnut Street, Hermistonfort</w:t>
       </w:r>
     </w:p>
     <w:p>
@@ -3131,7 +3131,7 @@
           </w:tcPr>
           <w:p>
             <w:r>
-              <w:t xml:space="preserve">82400 The Willows, Cristburgh</w:t>
+              <w:t xml:space="preserve">20087 Kozey Curve, Lizethton</w:t>
             </w:r>
           </w:p>
         </w:tc>
@@ -3267,7 +3267,7 @@
           </w:tcPr>
           <w:p>
             <w:r>
-              <w:t xml:space="preserve">The current statutory auditors of our Company, being Kirtane &amp; Shields - Littel Limited, Chartered Accountants</w:t>
+              <w:t xml:space="preserve">The current statutory auditors of our Company, being Kirtane &amp; Russel, Keebler and Bartell Limited, Chartered Accountants</w:t>
             </w:r>
           </w:p>
         </w:tc>
@@ -3333,7 +3333,7 @@
           </w:tcPr>
           <w:p>
             <w:r>
-              <w:t xml:space="preserve">Report titled “Industry Research Report on Magnet Winding Wires Market in India” dated November 26, 2025, prepared and issued by CARE Analytics and Goyette and Sons Limited which has been commissioned by and paid for by our Company pursuant to an engagement letter dated December 2, 2024 entered into with CARE Analytics and Goyette and Sons Limited, exclusively for the purposes of the Offer. The report will be available on the website of our Company athttps://kshinternational.com/investor-relations/industry-report/ from the date of this Red Herring Prospectus until the Bid/Offer Closing Date</w:t>
+              <w:t xml:space="preserve">Report titled “Industry Research Report on Magnet Winding Wires Market in India” dated November 26, 2025, prepared and issued by CARE Analytics and Stiedemann LLC Limited which has been commissioned by and paid for by our Company pursuant to an engagement letter dated December 2, 2024 entered into with CARE Analytics and Stiedemann LLC Limited, exclusively for the purposes of the Offer. The report will be available on the website of our Company athttps://kshinternational.com/investor-relations/industry-report/ from the date of this Red Herring Prospectus until the Bid/Offer Closing Date</w:t>
             </w:r>
           </w:p>
         </w:tc>
@@ -3355,7 +3355,7 @@
           </w:tcPr>
           <w:p>
             <w:r>
-              <w:t xml:space="preserve">The chairman and executive director of our Company, being Kushal Subbayya Hegde. For further details, see “Our Management – Board of Directors” on page 250</w:t>
+              <w:t xml:space="preserve">The chairman and executive director of our Company, being Hope Shields. For further details, see “Our Management – Board of Directors” on page 250</w:t>
             </w:r>
           </w:p>
         </w:tc>
@@ -3421,7 +3421,7 @@
           </w:tcPr>
           <w:p>
             <w:r>
-              <w:t xml:space="preserve">The company secretary and compliance officer of our Company, being Sarthak Malvadkar. For further details, see “General Information” and “Our Management – Key Managerial Personnel and Senior Management” on pages 74 and 266, respectively.</w:t>
+              <w:t xml:space="preserve">The company secretary and compliance officer of our Company, being Teresa Wisoky PhD. For further details, see “General Information” and “Our Management – Key Managerial Personnel and Senior Management” on pages 74 and 266, respectively.</w:t>
             </w:r>
           </w:p>
         </w:tc>
@@ -3483,7 +3483,7 @@
           </w:tcPr>
           <w:p>
             <w:r>
-              <w:t xml:space="preserve">564 Adolph Corners, North Janyland</w:t>
+              <w:t xml:space="preserve">16059 Koch Mills, Hawthorne</w:t>
             </w:r>
           </w:p>
         </w:tc>
@@ -3505,7 +3505,7 @@
           </w:tcPr>
           <w:p>
             <w:r>
-              <w:t xml:space="preserve">Kerluke Inc Limited</w:t>
+              <w:t xml:space="preserve">Leannon and Sons Limited</w:t>
             </w:r>
           </w:p>
         </w:tc>
@@ -3681,7 +3681,7 @@
           </w:tcPr>
           <w:p>
             <w:r>
-              <w:t xml:space="preserve">Entities, namely, Hirthe LLC Limited, Cruickshank Group Limited, KSH Infra Park 5 Private Limited, Weimann LLC Limited, Lockman and Sons Limited, Dietrich Group Limited, Kushal Motors and Paucek - Sporer Limited, Carroll - Thiel Limited, Dare, Zboncak and Sanford Limited, Keebler and Sons Limited, Labadie, Tremblay and Ullrich Limited, Wiegand-Marvin - Greenholt Limited, Kerluke Inc Limited, Schiller - Kunde Limited, Torphy - Conroy Limited, Boehm, Schuster and Bogan Limited Limited, Waterloo Industrial Park IX A PrivateLimited, and Schulist, Romaguera-Hirthe and MacGyver Limited</w:t>
+              <w:t xml:space="preserve">Entities, namely, Bernhard, Botsford and Hamill Limited, Grady, Murphy and Schneider Limited, KSH Infra Park 5 Private Limited, Schoen - Hilpert Limited, Stokes, Romaguera and Labadie Limited, Hudson, Bosco and Wiegand-Marvin Limited, Kushal Motors and Harber LLC Limited, Bosco, Lowe and Heller Limited, Mosciski - Prohaska Limited, Bode - Hirthe-Hilpert Limited, Romaguera-Hirthe, MacGyver and Brown Limited, Bednar Group Limited, Leannon and Sons Limited, McCullough - Grant Limited, Anderson-Wisozk, Legros and Lueilwitz Limited, Predovic, McDermott and Goyette Limited Limited, Waterloo Industrial Park IX A PrivateLimited, and Mraz, Kohler and Blick Limited</w:t>
             </w:r>
           </w:p>
         </w:tc>
@@ -3747,7 +3747,7 @@
           </w:tcPr>
           <w:p>
             <w:r>
-              <w:t xml:space="preserve">The industry data provider being, CARE Analytics and Goyette and Sons Limited</w:t>
+              <w:t xml:space="preserve">The industry data provider being, CARE Analytics and Stiedemann LLC Limited</w:t>
             </w:r>
           </w:p>
         </w:tc>
@@ -3781,17 +3781,17 @@
           </w:tcPr>
           <w:p>
             <w:r>
-              <w:t xml:space="preserve">Joint Managing Director</w:t>
-            </w:r>
-          </w:p>
-        </w:tc>
-        <w:tc>
-          <w:tcPr>
-            <w:tcW w:type="dxa" w:w="4500"/>
-          </w:tcPr>
-          <w:p>
-            <w:r>
-              <w:t xml:space="preserve">The joint managing director of our Company being, Rohit Kushal Hegde. For further details, see “Our Management” on page 250</w:t>
+              <w:t xml:space="preserve">Mr. Mateo Hagenes Director</w:t>
+            </w:r>
+          </w:p>
+        </w:tc>
+        <w:tc>
+          <w:tcPr>
+            <w:tcW w:type="dxa" w:w="4500"/>
+          </w:tcPr>
+          <w:p>
+            <w:r>
+              <w:t xml:space="preserve">The Mr. Mateo Hagenes director of our Company being, Lew Bergnaum. For further details, see “Our Management” on page 250</w:t>
             </w:r>
           </w:p>
         </w:tc>
@@ -3835,7 +3835,7 @@
           </w:tcPr>
           <w:p>
             <w:r>
-              <w:t xml:space="preserve">The managing director of our Company, namely Rajesh Kushal Hegde. For further information, see “Our Management – Board of Directors” on page 250</w:t>
+              <w:t xml:space="preserve">The managing director of our Company, namely Misael Blanda. For further information, see “Our Management – Board of Directors” on page 250</w:t>
             </w:r>
           </w:p>
         </w:tc>
@@ -3945,7 +3945,7 @@
           </w:tcPr>
           <w:p>
             <w:r>
-              <w:t xml:space="preserve">Kushal Subbayya Hegde, Pushpa Kushal Hegde, Broad Family Trust and Dhaulagiri Family Trust</w:t>
+              <w:t xml:space="preserve">Hope Shields, Miss Caroline Blanda Jr., Broad Family Trust and Dhaulagiri Family Trust</w:t>
             </w:r>
           </w:p>
         </w:tc>
@@ -3989,7 +3989,7 @@
           </w:tcPr>
           <w:p>
             <w:r>
-              <w:t xml:space="preserve">Kushal Subbayya Hegde, Pushpa Kushal Hegde, Rajesh Kushal Hegde, Rohit Kushal Hegde and Rakhi Girija Shetty, Dhaulagiri Family Trust, Everest Family Trust, Makalu Family Trust, BroadFamily Trust, Annapurna Family Trust, Kanchenjunga Family Trust and Kerluke Inc Limited</w:t>
+              <w:t xml:space="preserve">Hope Shields, Miss Caroline Blanda Jr., Misael Blanda, Lew Bergnaum and Lon Kozey, Dhaulagiri Family Trust, Everest Family Trust, Makalu Family Trust, BroadFamily Trust, Annapurna Family Trust, Kanchenjunga Family Trust and Leannon and Sons Limited</w:t>
             </w:r>
           </w:p>
         </w:tc>
@@ -4011,7 +4011,7 @@
           </w:tcPr>
           <w:p>
             <w:r>
-              <w:t xml:space="preserve">Kushal Subbayya Hegde, Pushpa Kushal Hegde, Rajesh Kushal Hegde and Rohit Kushal Hegde</w:t>
+              <w:t xml:space="preserve">Hope Shields, Miss Caroline Blanda Jr., Misael Blanda and Lew Bergnaum</w:t>
             </w:r>
           </w:p>
         </w:tc>
@@ -4055,7 +4055,7 @@
           </w:tcPr>
           <w:p>
             <w:r>
-              <w:t xml:space="preserve">Rajesh Kushal Hegde, his spouse, his children, lineal descendants and Everest Family Trust</w:t>
+              <w:t xml:space="preserve">Misael Blanda, his spouse, his children, lineal descendants and Everest Family Trust</w:t>
             </w:r>
           </w:p>
         </w:tc>
@@ -4077,7 +4077,7 @@
           </w:tcPr>
           <w:p>
             <w:r>
-              <w:t xml:space="preserve">Rakhi Girija Shetty, her spouse (if any), her children, lineal descendants and Annapurna Family Trust</w:t>
+              <w:t xml:space="preserve">Lon Kozey, her spouse (if any), her children, lineal descendants and Annapurna Family Trust</w:t>
             </w:r>
           </w:p>
         </w:tc>
@@ -4099,7 +4099,7 @@
           </w:tcPr>
           <w:p>
             <w:r>
-              <w:t xml:space="preserve">9140 Carroll Place, Hirthe-Granthaven</w:t>
+              <w:t xml:space="preserve">98976 Bayer Brooks, Port Leon</w:t>
             </w:r>
           </w:p>
         </w:tc>
@@ -4227,7 +4227,7 @@
           </w:tcPr>
           <w:p>
             <w:r>
-              <w:t xml:space="preserve">Rohit Kushal Hegde, his spouse, his children, lineal descendants and Makalu Family Trust</w:t>
+              <w:t xml:space="preserve">Lew Bergnaum, his spouse, his children, lineal descendants and Makalu Family Trust</w:t>
             </w:r>
           </w:p>
         </w:tc>
@@ -4381,7 +4381,7 @@
           </w:tcPr>
           <w:p>
             <w:r>
-              <w:t xml:space="preserve">Our manufacturing facility located at Plot No. 90908 Lueilwitz Walks, Jackelinefurt</w:t>
+              <w:t xml:space="preserve">Our manufacturing facility located at Plot No. 9884 Streich Spurs, Youngstown</w:t>
             </w:r>
           </w:p>
         </w:tc>
@@ -4403,7 +4403,7 @@
           </w:tcPr>
           <w:p>
             <w:r>
-              <w:t xml:space="preserve">9029 Market Place, Kohlerbury</w:t>
+              <w:t xml:space="preserve">7982 Moen-Fay Point, Osinskimouth</w:t>
             </w:r>
           </w:p>
         </w:tc>
@@ -4425,7 +4425,7 @@
           </w:tcPr>
           <w:p>
             <w:r>
-              <w:t xml:space="preserve">Our manufacturing facility located at Plot No. 1996 Paucek Crossing, Shoreline</w:t>
+              <w:t xml:space="preserve">Our manufacturing facility located at Plot No. 585 Collier Brooks, Effertzville</w:t>
             </w:r>
           </w:p>
         </w:tc>
@@ -4447,7 +4447,7 @@
           </w:tcPr>
           <w:p>
             <w:r>
-              <w:t xml:space="preserve">The whole-time director of our Company being, Rakhi Girija Shetty. For further information, see “Our Management – Board of Directors” on page 250</w:t>
+              <w:t xml:space="preserve">The whole-time director of our Company being, Lon Kozey. For further information, see “Our Management – Board of Directors” on page 250</w:t>
             </w:r>
           </w:p>
         </w:tc>
@@ -5257,7 +5257,7 @@
           </w:tcPr>
           <w:p>
             <w:r>
-              <w:t xml:space="preserve">The book running lead managers to the Offer namely, Johnson, Bayer and Schroeder Limited and Homenick, Smitham and Goodwin Limited</w:t>
+              <w:t xml:space="preserve">The book running lead managers to the Offer namely, Huel - Heidenreich Limited and Mueller and Sons Limited</w:t>
             </w:r>
           </w:p>
         </w:tc>
@@ -5737,7 +5737,7 @@
           </w:tcPr>
           <w:p>
             <w:r>
-              <w:t xml:space="preserve">The bank, which is a clearing member registered with SEBI as banker to an issue under the SEBI BTI Regulations and with whom the Escrow Accounts have been opened, in this case being Zulauf - Runte Limited</w:t>
+              <w:t xml:space="preserve">The bank, which is a clearing member registered with SEBI as banker to an issue under the SEBI BTI Regulations and with whom the Escrow Accounts have been opened, in this case being Kulas, Wuckert and Nader Limited</w:t>
             </w:r>
           </w:p>
         </w:tc>
@@ -5935,7 +5935,7 @@
           </w:tcPr>
           <w:p>
             <w:r>
-              <w:t xml:space="preserve">Homenick, Smitham and Goodwin Limited</w:t>
+              <w:t xml:space="preserve">Mueller and Sons Limited</w:t>
             </w:r>
           </w:p>
         </w:tc>
@@ -5979,7 +5979,7 @@
           </w:tcPr>
           <w:p>
             <w:r>
-              <w:t xml:space="preserve">The monitoring agency appointed pursuant to the Monitoring Agency Agreement, namely Klein, Moen-Fay and Herzog Limited</w:t>
+              <w:t xml:space="preserve">The monitoring agency appointed pursuant to the Monitoring Agency Agreement, namely Champlin - Nitzsche Limited</w:t>
             </w:r>
           </w:p>
         </w:tc>
@@ -6239,7 +6239,7 @@
           </w:tcPr>
           <w:p>
             <w:r>
-              <w:t xml:space="preserve">Johnson, Bayer and Schroeder Limited</w:t>
+              <w:t xml:space="preserve">Huel - Heidenreich Limited</w:t>
             </w:r>
           </w:p>
         </w:tc>
@@ -6305,7 +6305,7 @@
           </w:tcPr>
           <w:p>
             <w:r>
-              <w:t xml:space="preserve">The offer for sale component of the Offer of up to [●] Equity Shares of face value of ₹5 each aggregating up to ₹2,900.00 million, comprising of an offer for sale of up to [●] Equity Shares of face value of ₹5 each by Kushal Subbayya Hegde aggregating up to ₹1,528.00 million, up to [●] Equity Shares of face value of ₹5 each by Pushpa Kushal Hegde aggregating up to ₹422.00 million, up to [●] Equity Shares of face value of ₹5 each by Rajesh Kushal Hegde aggregating up to ₹475.00 million and up to [●] Equity Shares of face value of ₹5 each by Rohit Kushal Hegdeaggregating up to ₹475.00 million</w:t>
+              <w:t xml:space="preserve">The offer for sale component of the Offer of up to [●] Equity Shares of face value of ₹5 each aggregating up to ₹2,900.00 million, comprising of an offer for sale of up to [●] Equity Shares of face value of ₹5 each by Hope Shields aggregating up to ₹1,528.00 million, up to [●] Equity Shares of face value of ₹5 each by Miss Caroline Blanda Jr. aggregating up to ₹422.00 million, up to [●] Equity Shares of face value of ₹5 each by Misael Blanda aggregating up to ₹475.00 million and up to [●] Equity Shares of face value of ₹5 each by Rohit Kushal Hegdeaggregating up to ₹475.00 million</w:t>
             </w:r>
           </w:p>
         </w:tc>
@@ -6481,7 +6481,7 @@
           </w:tcPr>
           <w:p>
             <w:r>
-              <w:t xml:space="preserve">The bank with which the Public Offer Account has been opened for collection of Bid Amounts from Escrow Accounts and ASBA Accounts on the Designated Date, in this case being Rutherford - Lueilwitz Limited</w:t>
+              <w:t xml:space="preserve">The bank with which the Public Offer Account has been opened for collection of Bid Amounts from Escrow Accounts and ASBA Accounts on the Designated Date, in this case being Krajcik - Dicki Limited</w:t>
             </w:r>
           </w:p>
         </w:tc>
@@ -6653,7 +6653,7 @@
           </w:tcPr>
           <w:p>
             <w:r>
-              <w:t xml:space="preserve">The bank which is a clearing member registered with SEBI under the SEBI BTI Regulations with whom the Refund Account has been opened, in this case being Zulauf - Runte Limited</w:t>
+              <w:t xml:space="preserve">The bank which is a clearing member registered with SEBI under the SEBI BTI Regulations with whom the Refund Account has been opened, in this case being Kulas, Wuckert and Nader Limited</w:t>
             </w:r>
           </w:p>
         </w:tc>
@@ -6741,7 +6741,7 @@
           </w:tcPr>
           <w:p>
             <w:r>
-              <w:t xml:space="preserve">Hettinger - Fritsch-Kuphal Limited (Monahan - Gottlieb Limited)</w:t>
+              <w:t xml:space="preserve">Wehner - Bruen Limited (Okuneva, Lehner and Treutel Limited)</w:t>
             </w:r>
           </w:p>
         </w:tc>
@@ -6873,7 +6873,7 @@
           </w:tcPr>
           <w:p>
             <w:r>
-              <w:t xml:space="preserve">The share escrow agent appointed pursuant to the Share Escrow Agreement, namely, Hettinger - Fritsch-Kuphal Limited (Monahan - Gottlieb Limited)</w:t>
+              <w:t xml:space="preserve">The share escrow agent appointed pursuant to the Share Escrow Agreement, namely, Wehner - Bruen Limited (Okuneva, Lehner and Treutel Limited)</w:t>
             </w:r>
           </w:p>
         </w:tc>
@@ -6939,7 +6939,7 @@
           </w:tcPr>
           <w:p>
             <w:r>
-              <w:t xml:space="preserve">The Bankers to the Offer registered with SEBI, which have been appointed by our Company to act as a conduit between the Stock Exchanges and NPCI in order to push the UPI Mandate Requestand/or payment instructions of the UPI Bidders using the UPI and carry out other responsibilities, in terms of the UPI Circulars, in this case being Zulauf - Runte Limited and Rutherford - Lueilwitz Limited</w:t>
+              <w:t xml:space="preserve">The Bankers to the Offer registered with SEBI, which have been appointed by our Company to act as a conduit between the Stock Exchanges and NPCI in order to push the UPI Mandate Requestand/or payment instructions of the UPI Bidders using the UPI and carry out other responsibilities, in terms of the UPI Circulars, in this case being Kulas, Wuckert and Nader Limited and Krajcik - Dicki Limited</w:t>
             </w:r>
           </w:p>
         </w:tc>
@@ -6961,7 +6961,7 @@
           </w:tcPr>
           <w:p>
             <w:r>
-              <w:t xml:space="preserve">Collectively, Yost - Abshire Limited and National Stock Exchange of Russel, Buckridge and Harris Limited</w:t>
+              <w:t xml:space="preserve">Collectively, Upton Group Limited and National Stock Exchange of Blick Inc Limited</w:t>
             </w:r>
           </w:p>
         </w:tc>
@@ -7027,7 +7027,7 @@
           </w:tcPr>
           <w:p>
             <w:r>
-              <w:t xml:space="preserve">Intermediaries (other than the BRLMs) registered with SEBI who are permitted to accept bids, applications and place order with respect to the Offer and carry out activities as an underwriter,namely, Johnson, Bayer and Schroeder Limited and Homenick, Smitham and Goodwin Limited</w:t>
+              <w:t xml:space="preserve">Intermediaries (other than the BRLMs) registered with SEBI who are permitted to accept bids, applications and place order with respect to the Offer and carry out activities as an underwriter,namely, Huel - Heidenreich Limited and Mueller and Sons Limited</w:t>
             </w:r>
           </w:p>
         </w:tc>
@@ -7101,17 +7101,17 @@
           </w:tcPr>
           <w:p>
             <w:r>
-              <w:t xml:space="preserve">Systemically Important Non-Collier Group Limited/ NBFC-SI</w:t>
-            </w:r>
-          </w:p>
-        </w:tc>
-        <w:tc>
-          <w:tcPr>
-            <w:tcW w:type="dxa" w:w="4500"/>
-          </w:tcPr>
-          <w:p>
-            <w:r>
-              <w:t xml:space="preserve">Systemically important non-banking financial company as defined under Regulation 2(1)(iii) of the SEBI ICDR Regulations</w:t>
+              <w:t xml:space="preserve">Systemically Important Non-Dare - Koelpin Limited/ NBFC-SI</w:t>
+            </w:r>
+          </w:p>
+        </w:tc>
+        <w:tc>
+          <w:tcPr>
+            <w:tcW w:type="dxa" w:w="4500"/>
+          </w:tcPr>
+          <w:p>
+            <w:r>
+              <w:t xml:space="preserve">Systemically important non-Dare - Koelpin Limited as defined under Regulation 2(1)(iii) of the SEBI ICDR Regulations</w:t>
             </w:r>
           </w:p>
         </w:tc>
@@ -7467,7 +7467,7 @@
           </w:tcPr>
           <w:p>
             <w:r>
-              <w:t xml:space="preserve">Yost - Abshire Limited</w:t>
+              <w:t xml:space="preserve">Upton Group Limited</w:t>
             </w:r>
           </w:p>
         </w:tc>
@@ -8651,7 +8651,7 @@
           </w:tcPr>
           <w:p>
             <w:r>
-              <w:t xml:space="preserve">Effertz, Heller and Kertzmann Limited of India</w:t>
+              <w:t xml:space="preserve">Pollich - Murazik Limited of India</w:t>
             </w:r>
           </w:p>
         </w:tc>
@@ -8739,7 +8739,7 @@
           </w:tcPr>
           <w:p>
             <w:r>
-              <w:t xml:space="preserve">Sawayn, Stoltenberg and Walter Limited</w:t>
+              <w:t xml:space="preserve">Beier - Rogahn Limited</w:t>
             </w:r>
           </w:p>
         </w:tc>
@@ -8761,7 +8761,7 @@
           </w:tcPr>
           <w:p>
             <w:r>
-              <w:t xml:space="preserve">National Stock Exchange of Russel, Buckridge and Harris Limited</w:t>
+              <w:t xml:space="preserve">National Stock Exchange of Blick Inc Limited</w:t>
             </w:r>
           </w:p>
         </w:tc>
@@ -11111,7 +11111,7 @@
           </w:tcPr>
           <w:p>
             <w:r>
-              <w:t xml:space="preserve">Wuckert Inc Limited</w:t>
+              <w:t xml:space="preserve">Kuhic - Koepp Limited</w:t>
             </w:r>
           </w:p>
         </w:tc>
@@ -11353,7 +11353,7 @@
           </w:tcPr>
           <w:p>
             <w:r>
-              <w:t xml:space="preserve">Blanda - Corwin Limited of Russel, Buckridge and Harris Limited</w:t>
+              <w:t xml:space="preserve">Ratke, Lemke and Lemke Limited of Blick Inc Limited</w:t>
             </w:r>
           </w:p>
         </w:tc>
@@ -12138,7 +12138,7 @@
     </w:p>
     <w:p>
       <w:r>
-        <w:t xml:space="preserve">Unless stated otherwise, industry and market data used in this Red Herring Prospectus has been obtained or derived from the report titled “Industry Research Report on Magnet Winding Wires Market in India” dated November 26, 2025 (“CARE Report”), prepared by CARE Analytics and Goyette and Sons Limited (“CareEdge Research”), which has been prepared exclusively for the purpose of understanding the industry in connection with the Offer and commissioned and paid for by our Company, pursuant to the engagement letter dated December 2, 2024. The CARE Report is available on the website of our Company at the following weblink: https://kshinternational.com/investor-relations/industry-report/. Further, CareEdge Research, pursuant to their consent letter dated November 26, 2025 (“Letter”) has accorded their no objection and consent to use the CARE Report. CareEdge Research, pursuant to their Letter, has also confirmed that it is an independent agency and has no conflict of interest issuing the CARE Report, and confirmed that it is not related, either directly or indirectly, to our Company, our Directors, our Promoters (including the Promoter Selling Shareholders), our Key Managerial Personnel, our Senior Management, our Group Companies or the Book Running Lead Managers.</w:t>
+        <w:t xml:space="preserve">Unless stated otherwise, industry and market data used in this Red Herring Prospectus has been obtained or derived from the report titled “Industry Research Report on Magnet Winding Wires Market in India” dated November 26, 2025 (“CARE Report”), prepared by CARE Analytics and Stiedemann LLC Limited (“CareEdge Research”), which has been prepared exclusively for the purpose of understanding the industry in connection with the Offer and commissioned and paid for by our Company, pursuant to the engagement letter dated December 2, 2024. The CARE Report is available on the website of our Company at the following weblink: https://kshinternational.com/investor-relations/industry-report/. Further, CareEdge Research, pursuant to their consent letter dated November 26, 2025 (“Letter”) has accorded their no objection and consent to use the CARE Report. CareEdge Research, pursuant to their Letter, has also confirmed that it is an independent agency and has no conflict of interest issuing the CARE Report, and confirmed that it is not related, either directly or indirectly, to our Company, our Directors, our Promoters (including the Promoter Selling Shareholders), our Key Managerial Personnel, our Senior Management, our Group Companies or the Book Running Lead Managers.</w:t>
       </w:r>
     </w:p>
     <w:p>
@@ -12792,7 +12792,7 @@
     </w:p>
     <w:p>
       <w:r>
-        <w:t xml:space="preserve">Kushal Subbayya Hegde, Pushpa Kushal Hegde, Rajesh Kushal Hegde, Rohit Kushal Hegde, Rakhi Girija Shetty, Dhaulagiri Family Trust, Everest Family Trust, Makalu Family Trust, Broad Family Trust, Annapurna Family Trust, Kanchenjunga Family Trust and Kerluke Inc Limited are the Promoters of our Company.</w:t>
+        <w:t xml:space="preserve">Hope Shields, Miss Caroline Blanda Jr., Misael Blanda, Lew Bergnaum, Lon Kozey, Dhaulagiri Family Trust, Everest Family Trust, Makalu Family Trust, Broad Family Trust, Annapurna Family Trust, Kanchenjunga Family Trust and Leannon and Sons Limited are the Promoters of our Company.</w:t>
       </w:r>
     </w:p>
     <w:p>
@@ -13362,7 +13362,7 @@
           </w:tcPr>
           <w:p>
             <w:r>
-              <w:t xml:space="preserve">Kushal Subbayya Hegde*</w:t>
+              <w:t xml:space="preserve">Hope Shields*</w:t>
             </w:r>
           </w:p>
         </w:tc>
@@ -13424,7 +13424,7 @@
           </w:tcPr>
           <w:p>
             <w:r>
-              <w:t xml:space="preserve">Pushpa Kushal Hegde*</w:t>
+              <w:t xml:space="preserve">Miss Caroline Blanda Jr.*</w:t>
             </w:r>
           </w:p>
         </w:tc>
@@ -13486,7 +13486,7 @@
           </w:tcPr>
           <w:p>
             <w:r>
-              <w:t xml:space="preserve">Rajesh Kushal Hegde*</w:t>
+              <w:t xml:space="preserve">Misael Blanda*</w:t>
             </w:r>
           </w:p>
         </w:tc>
@@ -13548,7 +13548,7 @@
           </w:tcPr>
           <w:p>
             <w:r>
-              <w:t xml:space="preserve">Rohit Kushal Hegde*</w:t>
+              <w:t xml:space="preserve">Lew Bergnaum*</w:t>
             </w:r>
           </w:p>
         </w:tc>
@@ -13610,7 +13610,7 @@
           </w:tcPr>
           <w:p>
             <w:r>
-              <w:t xml:space="preserve">Rakhi Girija Shetty</w:t>
+              <w:t xml:space="preserve">Lon Kozey</w:t>
             </w:r>
           </w:p>
         </w:tc>
@@ -15277,7 +15277,7 @@
           </w:tcPr>
           <w:p>
             <w:r>
-              <w:t xml:space="preserve">Rakhi Girija Shetty</w:t>
+              <w:t xml:space="preserve">Lon Kozey</w:t>
             </w:r>
           </w:p>
         </w:tc>
@@ -16213,7 +16213,7 @@
           </w:tcPr>
           <w:p>
             <w:r>
-              <w:t xml:space="preserve">Hegmann - Orn Limited</w:t>
+              <w:t xml:space="preserve">Aufderhar - Hansen Limited</w:t>
             </w:r>
           </w:p>
         </w:tc>
@@ -18946,7 +18946,7 @@
         </w:numPr>
       </w:pPr>
       <w:r>
-        <w:t xml:space="preserve">Certain of our KMPs including, Kushal Subbayya Hegde, Rajesh Kushal Hegde, Rohit Kushal Hegde and Rakhi Girija Shetty are also our Executive Directors. Hence, litigation against our Executive Directors have not been included under the heading of KMPs to avoid repetition.</w:t>
+        <w:t xml:space="preserve">Certain of our KMPs including, Hope Shields, Misael Blanda, Lew Bergnaum and Lon Kozey are also our Executive Directors. Hence, litigation against our Executive Directors have not been included under the heading of KMPs to avoid repetition.</w:t>
       </w:r>
     </w:p>
     <w:p>
@@ -18958,7 +18958,7 @@
         </w:numPr>
       </w:pPr>
       <w:r>
-        <w:t xml:space="preserve">Certain of our SMs including, Sandesh Bhagwat, CEO, Amod Joshi, CFO, Sarthak Malvadkar, CS and Compliance Officer, and Ganesh Prasad, Technical Director, are also our KMPs. Hence, litigation against our KMPs have not been included under the heading of SMs to avoid repetition.</w:t>
+        <w:t xml:space="preserve">Certain of our SMs including, Sandesh Bhagwat, CEO, Amod Joshi, CFO, Teresa Wisoky PhD, CS and Compliance Officer, and Ganesh Prasad, Technical Director, are also our KMPs. Hence, litigation against our KMPs have not been included under the heading of SMs to avoid repetition.</w:t>
       </w:r>
     </w:p>
     <w:p>
@@ -19730,7 +19730,7 @@
           </w:tcPr>
           <w:p>
             <w:r>
-              <w:t xml:space="preserve">Cummings - Bogisich Limited</w:t>
+              <w:t xml:space="preserve">Parisian - Bogisich Limited</w:t>
             </w:r>
           </w:p>
         </w:tc>
@@ -20703,7 +20703,7 @@
           </w:tcPr>
           <w:p>
             <w:r>
-              <w:t xml:space="preserve">Kushal Subbayya Hegde*</w:t>
+              <w:t xml:space="preserve">Hope Shields*</w:t>
             </w:r>
           </w:p>
         </w:tc>
@@ -20786,7 +20786,7 @@
           </w:tcPr>
           <w:p>
             <w:r>
-              <w:t xml:space="preserve">Pushpa Kushal Hegde*</w:t>
+              <w:t xml:space="preserve">Miss Caroline Blanda Jr.*</w:t>
             </w:r>
           </w:p>
         </w:tc>
@@ -20818,7 +20818,7 @@
           </w:tcPr>
           <w:p>
             <w:r>
-              <w:t xml:space="preserve">Rajesh Kushal Hegde*</w:t>
+              <w:t xml:space="preserve">Misael Blanda*</w:t>
             </w:r>
           </w:p>
         </w:tc>
@@ -20850,7 +20850,7 @@
           </w:tcPr>
           <w:p>
             <w:r>
-              <w:t xml:space="preserve">Rohit Kushal Hegde*</w:t>
+              <w:t xml:space="preserve">Lew Bergnaum*</w:t>
             </w:r>
           </w:p>
         </w:tc>
@@ -20882,7 +20882,7 @@
           </w:tcPr>
           <w:p>
             <w:r>
-              <w:t xml:space="preserve">Rakhi Girija Shetty</w:t>
+              <w:t xml:space="preserve">Lon Kozey</w:t>
             </w:r>
           </w:p>
         </w:tc>
@@ -21118,7 +21118,7 @@
     </w:p>
     <w:p>
       <w:r>
-        <w:t xml:space="preserve">(1) As certified by Kirtane &amp; Shields - Littel Limited, Chartered Accountants, our Statutory Auditors, by way of their certificate dated December 10, 2025.</w:t>
+        <w:t xml:space="preserve">(1) As certified by Kirtane &amp; Russel, Keebler and Bartell Limited, Chartered Accountants, our Statutory Auditors, by way of their certificate dated December 10, 2025.</w:t>
       </w:r>
     </w:p>
     <w:p>
@@ -21324,7 +21324,7 @@
     <w:p/>
     <w:p>
       <w:r>
-        <w:t xml:space="preserve">*	As certified by Kirtane &amp; Shields - Littel Limited, Chartered Accountants, our Statutory Auditors, by way of their certificate dated December 10, 2025.</w:t>
+        <w:t xml:space="preserve">*	As certified by Kirtane &amp; Russel, Keebler and Bartell Limited, Chartered Accountants, our Statutory Auditors, by way of their certificate dated December 10, 2025.</w:t>
       </w:r>
     </w:p>
     <w:p>
@@ -21406,7 +21406,7 @@
           </w:tcPr>
           <w:p>
             <w:r>
-              <w:t xml:space="preserve">Kushal Subbayya Hegde*</w:t>
+              <w:t xml:space="preserve">Hope Shields*</w:t>
             </w:r>
           </w:p>
         </w:tc>
@@ -21438,7 +21438,7 @@
           </w:tcPr>
           <w:p>
             <w:r>
-              <w:t xml:space="preserve">Pushpa Kushal Hegde*</w:t>
+              <w:t xml:space="preserve">Miss Caroline Blanda Jr.*</w:t>
             </w:r>
           </w:p>
         </w:tc>
@@ -21470,7 +21470,7 @@
           </w:tcPr>
           <w:p>
             <w:r>
-              <w:t xml:space="preserve">Rajesh Kushal Hegde*</w:t>
+              <w:t xml:space="preserve">Misael Blanda*</w:t>
             </w:r>
           </w:p>
         </w:tc>
@@ -21502,7 +21502,7 @@
           </w:tcPr>
           <w:p>
             <w:r>
-              <w:t xml:space="preserve">Rohit Kushal Hegde*</w:t>
+              <w:t xml:space="preserve">Lew Bergnaum*</w:t>
             </w:r>
           </w:p>
         </w:tc>
@@ -21534,7 +21534,7 @@
           </w:tcPr>
           <w:p>
             <w:r>
-              <w:t xml:space="preserve">Rakhi Girija Shetty</w:t>
+              <w:t xml:space="preserve">Lon Kozey</w:t>
             </w:r>
           </w:p>
         </w:tc>
@@ -21760,7 +21760,7 @@
     </w:p>
     <w:p>
       <w:r>
-        <w:t xml:space="preserve">**  As certified by Kirtane &amp; Shields - Littel Limited, Chartered Accountants, our Statutory Auditors, by way of their certificate dated December 10, 2025.</w:t>
+        <w:t xml:space="preserve">**  As certified by Kirtane &amp; Russel, Keebler and Bartell Limited, Chartered Accountants, our Statutory Auditors, by way of their certificate dated December 10, 2025.</w:t>
       </w:r>
     </w:p>
     <w:p>
@@ -21911,7 +21911,7 @@
           </w:tcPr>
           <w:p>
             <w:r>
-              <w:t xml:space="preserve">Kushal Subbayya Hegde*^&amp;</w:t>
+              <w:t xml:space="preserve">Hope Shields*^&amp;</w:t>
             </w:r>
           </w:p>
         </w:tc>
@@ -21963,7 +21963,7 @@
           </w:tcPr>
           <w:p>
             <w:r>
-              <w:t xml:space="preserve">Pushpa Kushal Hegde*^&amp;</w:t>
+              <w:t xml:space="preserve">Miss Caroline Blanda Jr.*^&amp;</w:t>
             </w:r>
           </w:p>
         </w:tc>
@@ -22015,7 +22015,7 @@
           </w:tcPr>
           <w:p>
             <w:r>
-              <w:t xml:space="preserve">Rajesh Kushal Hegde*^&amp;</w:t>
+              <w:t xml:space="preserve">Misael Blanda*^&amp;</w:t>
             </w:r>
           </w:p>
         </w:tc>
@@ -22067,7 +22067,7 @@
           </w:tcPr>
           <w:p>
             <w:r>
-              <w:t xml:space="preserve">Rohit Kushal Hegde*^&amp;</w:t>
+              <w:t xml:space="preserve">Lew Bergnaum*^&amp;</w:t>
             </w:r>
           </w:p>
         </w:tc>
@@ -22119,7 +22119,7 @@
           </w:tcPr>
           <w:p>
             <w:r>
-              <w:t xml:space="preserve">Rakhi Girija Shetty&amp;</w:t>
+              <w:t xml:space="preserve">Lon Kozey&amp;</w:t>
             </w:r>
           </w:p>
         </w:tc>
@@ -22171,7 +22171,7 @@
           </w:tcPr>
           <w:p>
             <w:r>
-              <w:t xml:space="preserve">Rakhi Girija Shetty^&amp;</w:t>
+              <w:t xml:space="preserve">Lon Kozey^&amp;</w:t>
             </w:r>
           </w:p>
         </w:tc>
@@ -22792,7 +22792,7 @@
     <w:p/>
     <w:p>
       <w:r>
-        <w:t xml:space="preserve">#	As certified by Kirtane &amp; Shields - Littel Limited, Chartered Accountants, our Statutory Auditors, by way of their certificate dated December 10, 2025.</w:t>
+        <w:t xml:space="preserve">#	As certified by Kirtane &amp; Russel, Keebler and Bartell Limited, Chartered Accountants, our Statutory Auditors, by way of their certificate dated December 10, 2025.</w:t>
       </w:r>
     </w:p>
     <w:p>
@@ -22892,7 +22892,7 @@
           </w:tcPr>
           <w:p>
             <w:r>
-              <w:t xml:space="preserve">Kushal Subbayya Hegde</w:t>
+              <w:t xml:space="preserve">Hope Shields</w:t>
             </w:r>
           </w:p>
         </w:tc>
@@ -22934,7 +22934,7 @@
           </w:tcPr>
           <w:p>
             <w:r>
-              <w:t xml:space="preserve">Kushal Subbayya Hegde</w:t>
+              <w:t xml:space="preserve">Hope Shields</w:t>
             </w:r>
           </w:p>
         </w:tc>
@@ -22976,7 +22976,7 @@
           </w:tcPr>
           <w:p>
             <w:r>
-              <w:t xml:space="preserve">Kushal Subbayya Hegde</w:t>
+              <w:t xml:space="preserve">Hope Shields</w:t>
             </w:r>
           </w:p>
         </w:tc>
@@ -23018,7 +23018,7 @@
           </w:tcPr>
           <w:p>
             <w:r>
-              <w:t xml:space="preserve">Pushpa Kushal Hegde</w:t>
+              <w:t xml:space="preserve">Miss Caroline Blanda Jr.</w:t>
             </w:r>
           </w:p>
         </w:tc>
@@ -23060,7 +23060,7 @@
           </w:tcPr>
           <w:p>
             <w:r>
-              <w:t xml:space="preserve">Pushpa Kushal Hegde</w:t>
+              <w:t xml:space="preserve">Miss Caroline Blanda Jr.</w:t>
             </w:r>
           </w:p>
         </w:tc>
@@ -23102,7 +23102,7 @@
           </w:tcPr>
           <w:p>
             <w:r>
-              <w:t xml:space="preserve">Pushpa Kushal Hegde</w:t>
+              <w:t xml:space="preserve">Miss Caroline Blanda Jr.</w:t>
             </w:r>
           </w:p>
         </w:tc>
@@ -23221,7 +23221,7 @@
     </w:p>
     <w:p>
       <w:r>
-        <w:t xml:space="preserve">Unless stated otherwise, industry and market data used in this section has been obtained or derived from the report titled “Industry Research Report on Magnet Winding Wires Market in India” dated November 26, 2025 (“CARE Report”), prepared and issued by Care Analytics and Goyette and Sons Limited pursuant to an engagement letter dated December 2, 2024, and exclusively commissioned and paid for by us in connection with the Offer. The industry-related information included herein includes excerpts from the CARE Report and may have been re-ordered by us for the purposes of presentation. Unless otherwise indicated, all financial, operational, industry and other related information derived from the CARE Report and included herein with respect to any particular year refers to such information for the relevant calendar year. The CARE Report will be available on the website of our Company from the date of this Red Herring Prospectus until the Bid/Offer Closing Date. For more information, see “Certain Conventions, Use of Financial Information and Market Data and Currency of Presentation” on page 15.</w:t>
+        <w:t xml:space="preserve">Unless stated otherwise, industry and market data used in this section has been obtained or derived from the report titled “Industry Research Report on Magnet Winding Wires Market in India” dated November 26, 2025 (“CARE Report”), prepared and issued by Care Analytics and Stiedemann LLC Limited pursuant to an engagement letter dated December 2, 2024, and exclusively commissioned and paid for by us in connection with the Offer. The industry-related information included herein includes excerpts from the CARE Report and may have been re-ordered by us for the purposes of presentation. Unless otherwise indicated, all financial, operational, industry and other related information derived from the CARE Report and included herein with respect to any particular year refers to such information for the relevant calendar year. The CARE Report will be available on the website of our Company from the date of this Red Herring Prospectus until the Bid/Offer Closing Date. For more information, see “Certain Conventions, Use of Financial Information and Market Data and Currency of Presentation” on page 15.</w:t>
       </w:r>
     </w:p>
     <w:p>
@@ -24911,7 +24911,7 @@
     </w:p>
     <w:p>
       <w:r>
-        <w:t xml:space="preserve">Note: Our top 10 customers include Al-Ahleia Switchgear Co., Hickle - Batz Limited; CG Power and Swift, Gorczany and Denesik Limited; Emirates Transformer &amp; Mosciski - Rogahn Limited; Tremblay - Breitenberg Limited; Glover Inc Limited; Transformers &amp; Rectifiers (India) Limited; and Hansen - Medhurst Limited. Names of other customers who form part of our top 10 customers during the periods/ Fiscals included above, have not been included in this Red Herring Prospectus due to non-receipt of consent from such customers to be named in the Offer Documents.</w:t>
+        <w:t xml:space="preserve">Note: Our top 10 customers include Al-Ahleia Switchgear Co., Kemmer Group Limited; CG Power and Marks - Moen-Ferry Limited; Emirates Transformer &amp; Crooks - Daniel Limited; Jenkins, Jacobi and Schumm Limited; Ward - Goyette Limited; Transformers &amp; Rectifiers (India) Limited; and Kautzer, Buckridge and McClure Limited. Names of other customers who form part of our top 10 customers during the periods/ Fiscals included above, have not been included in this Red Herring Prospectus due to non-receipt of consent from such customers to be named in the Offer Documents.</w:t>
       </w:r>
     </w:p>
     <w:p>
@@ -26311,7 +26311,7 @@
     </w:p>
     <w:p>
       <w:r>
-        <w:t xml:space="preserve">Note: Our top 10 suppliers include Ahlstrom Sweden AB; Bogisich, Rodriguez and Graham Limited; Hermiston and Sons Limited; Cremin Group Limited; Polycom Associates; Daniel - Leffler Limited; Union Copper Rod LLC; and Jacobi and Sons Limited Sterlite Copper. Names of other suppliers have not been included in this Red Herring Prospectus due to non-receipt of consent from such suppliers to be named in the Offer Documents.</w:t>
+        <w:t xml:space="preserve">Note: Our top 10 suppliers include Ahlstrom Sweden AB; Bechtelar - Berge Limited; Funk, Mertz and Heller Limited; Casper-Renner, Bergstrom and Spinka Limited; Polycom Associates; Cruickshank - Ondricka Limited; Union Copper Rod LLC; and Huel and Sons Limited Sterlite Copper. Names of other suppliers have not been included in this Red Herring Prospectus due to non-receipt of consent from such suppliers to be named in the Offer Documents.</w:t>
       </w:r>
     </w:p>
     <w:p>
@@ -30298,7 +30298,7 @@
     </w:p>
     <w:p>
       <w:r>
-        <w:t xml:space="preserve">(i) certificate of enrolment issued by Maharashtra Sales Tax Department under the Maharashtra State Tax on Professions, Trades, Callings and Employment Act, 1975 and (ii) for amending the name of our Company in certain regulatory approvals and licenses issued under our old name “Bauch, Armstrong and O'Connell Limited”. Additionally, we are yet to make an application for obtaining the building completion certificate issued in relation to Unit 2 by the Pune Metropolitan Region Development Authority. For details, see “Government and Other Approvals – C. Material approvals in relation to our Company – IV. Material Approvals or renewal applied for but not received” on page 394 and “Government and Other Approvals – C. Material approvals in relation to our Company – IV. Material Approvals for which fresh applications/renewal applications are yet to be made” on page 395. We cannot assure you that these approvals will be granted by the relevant authorities. In the event these approvals are not granted, we will have to make alternate manufacturing arrangements including increasing production in our other existing manufacturing facilities, which may adversely impact our business, financial condition, results of operations, cash flows and prospects. Further, we may be required to obtain a no objection certificate under the relevant state tenancy laws, when applying for a factory license. For further details of pending renewals and pending material approvals, see “Government and Other Approvals” on page 393. If we fail to retain, renew or receive any of such approvals, licenses, registrations, permissions or renewals, in a timely manner or at all, our business, financial condition, results of operations, cash flows and prospects may be adversely affected.</w:t>
+        <w:t xml:space="preserve">(i) certificate of enrolment issued by Maharashtra Sales Tax Department under the Maharashtra State Tax on Professions, Trades, Callings and Employment Act, 1975 and (ii) for amending the name of our Company in certain regulatory approvals and licenses issued under our old name “Pouros - Rath Limited”. Additionally, we are yet to make an application for obtaining the building completion certificate issued in relation to Unit 2 by the Pune Metropolitan Region Development Authority. For details, see “Government and Other Approvals – C. Material approvals in relation to our Company – IV. Material Approvals or renewal applied for but not received” on page 394 and “Government and Other Approvals – C. Material approvals in relation to our Company – IV. Material Approvals for which fresh applications/renewal applications are yet to be made” on page 395. We cannot assure you that these approvals will be granted by the relevant authorities. In the event these approvals are not granted, we will have to make alternate manufacturing arrangements including increasing production in our other existing manufacturing facilities, which may adversely impact our business, financial condition, results of operations, cash flows and prospects. Further, we may be required to obtain a no objection certificate under the relevant state tenancy laws, when applying for a factory license. For further details of pending renewals and pending material approvals, see “Government and Other Approvals” on page 393. If we fail to retain, renew or receive any of such approvals, licenses, registrations, permissions or renewals, in a timely manner or at all, our business, financial condition, results of operations, cash flows and prospects may be adversely affected.</w:t>
       </w:r>
     </w:p>
     <w:p>
@@ -30348,7 +30348,7 @@
         </w:numPr>
       </w:pPr>
       <w:r>
-        <w:t xml:space="preserve">Annual returns filed by the Company beginning from the Fiscal 1980 until the Fiscal 2003, except for the Fiscals ended March 31, 1983, and March 31, 1988;Financial statements, (a) between the Fiscal 1980 until March 31, 1985, (b) between the Fiscal 1986 until March 31, 2005, and (c) between the Fiscals 2011 and 2014;Form 1, Form 1A and Form 18 along with corresponding RoC challans for incorporation of the Company dated July 30, 1979, application for reservation of name, and intimation of registered office respectively;Form 23, Forms 1A and 1B along with corresponding RoC challans for change of name of the Company from “Leuschke Group Limited” to “Bauch, Armstrong and O'Connell Limited” dated July 4, 1996;Form 32 along with corresponding challan for regularization as director in relation to Rajesh Kushal Hegde dated September 26, 1996;Form 32 along with corresponding RoC challan for appointment as additional director in relation to Rohit Kushal Hegde dated November 1, 2000;Form 32 along with the corresponding RoC challan for regularisation as director in relation to Rohit Kushal Hegde dated September 21, 2000;Copies or counter folios of share certificates issued to the shareholders; andShare transfer forms for all secondary transactions of equity shares, including the following transfers involving the Promoter Selling Shareholders:</w:t>
+        <w:t xml:space="preserve">Annual returns filed by the Company beginning from the Fiscal 1980 until the Fiscal 2003, except for the Fiscals ended March 31, 1983, and March 31, 1988;Financial statements, (a) between the Fiscal 1980 until March 31, 1985, (b) between the Fiscal 1986 until March 31, 2005, and (c) between the Fiscals 2011 and 2014;Form 1, Form 1A and Form 18 along with corresponding RoC challans for incorporation of the Company dated July 30, 1979, application for reservation of name, and intimation of registered office respectively;Form 23, Forms 1A and 1B along with corresponding RoC challans for change of name of the Company from “Moen - Olson Limited” to “Pouros - Rath Limited” dated July 4, 1996;Form 32 along with corresponding challan for regularization as director in relation to Misael Blanda dated September 26, 1996;Form 32 along with corresponding RoC challan for appointment as additional director in relation to Lew Bergnaum dated November 1, 2000;Form 32 along with the corresponding RoC challan for regularisation as director in relation to Lew Bergnaum dated September 21, 2000;Copies or counter folios of share certificates issued to the shareholders; andShare transfer forms for all secondary transactions of equity shares, including the following transfers involving the Promoter Selling Shareholders:</w:t>
       </w:r>
     </w:p>
     <w:p>
@@ -30396,7 +30396,7 @@
         </w:numPr>
       </w:pPr>
       <w:r>
-        <w:t xml:space="preserve">Form 23, Forms 1A and 1B along with corresponding RoC challans for change of name of the Company from “Leuschke Group Limited” to “Bauch, Armstrong and O'Connell Limited” dated July 4, 1996;</w:t>
+        <w:t xml:space="preserve">Form 23, Forms 1A and 1B along with corresponding RoC challans for change of name of the Company from “Moen - Olson Limited” to “Pouros - Rath Limited” dated July 4, 1996;</w:t>
       </w:r>
     </w:p>
     <w:p>
@@ -30408,7 +30408,7 @@
         </w:numPr>
       </w:pPr>
       <w:r>
-        <w:t xml:space="preserve">Form 32 along with corresponding challan for regularization as director in relation to Rajesh Kushal Hegde dated September 26, 1996;</w:t>
+        <w:t xml:space="preserve">Form 32 along with corresponding challan for regularization as director in relation to Misael Blanda dated September 26, 1996;</w:t>
       </w:r>
     </w:p>
     <w:p>
@@ -30420,7 +30420,7 @@
         </w:numPr>
       </w:pPr>
       <w:r>
-        <w:t xml:space="preserve">Form 32 along with corresponding RoC challan for appointment as additional director in relation to Rohit Kushal Hegde dated November 1, 2000;</w:t>
+        <w:t xml:space="preserve">Form 32 along with corresponding RoC challan for appointment as additional director in relation to Lew Bergnaum dated November 1, 2000;</w:t>
       </w:r>
     </w:p>
     <w:p>
@@ -30432,7 +30432,7 @@
         </w:numPr>
       </w:pPr>
       <w:r>
-        <w:t xml:space="preserve">Form 32 along with the corresponding RoC challan for regularisation as director in relation to Rohit Kushal Hegde dated September 21, 2000;</w:t>
+        <w:t xml:space="preserve">Form 32 along with the corresponding RoC challan for regularisation as director in relation to Lew Bergnaum dated September 21, 2000;</w:t>
       </w:r>
     </w:p>
     <w:p>
@@ -30870,7 +30870,7 @@
           </w:tcPr>
           <w:p>
             <w:r>
-              <w:t xml:space="preserve">Form 7B for transfer of shares to Rajesh Kushal Hegde from Narayana B. Shetty</w:t>
+              <w:t xml:space="preserve">Form 7B for transfer of shares to Misael Blanda from Narayana B. Shetty</w:t>
             </w:r>
           </w:p>
         </w:tc>
@@ -30912,7 +30912,7 @@
           </w:tcPr>
           <w:p>
             <w:r>
-              <w:t xml:space="preserve">Form 7B for transfer of shares to Kushal Hegde from Shubhkamal Leasing and D'Amore, Lynch and Runte Limited</w:t>
+              <w:t xml:space="preserve">Form 7B for transfer of shares to Kushal Hegde from Shubhkamal Leasing and Gutkowski LLC Limited</w:t>
             </w:r>
           </w:p>
         </w:tc>
@@ -30996,7 +30996,7 @@
           </w:tcPr>
           <w:p>
             <w:r>
-              <w:t xml:space="preserve">Form 7B for transfer of shares to Rajesh Kushal Hegde from Shubhkamal Leasing and D'Amore, Lynch and Runte Limited</w:t>
+              <w:t xml:space="preserve">Form 7B for transfer of shares to Misael Blanda from Shubhkamal Leasing and Gutkowski LLC Limited</w:t>
             </w:r>
           </w:p>
         </w:tc>
@@ -31304,12 +31304,12 @@
     </w:p>
     <w:p>
       <w:r>
-        <w:t xml:space="preserve">We have been unable to trace these documents despite commissioning a detailed search at the Registrar of Companies, through an independent practicing company secretary, Kanj and Lang - Monahan Limited (“Kshlerin - Hauck Limited Secretary”), to trace records and filings available with Registrar of Companies and reliance has been placed on the certificate dated May 21, 2025, issued by the Kshlerin - Hauck Limited Secretary. We have also intimated the Registrar of Companies by way of our letter dated May 21, 2025, regarding the missing corporate records.</w:t>
-      </w:r>
-    </w:p>
-    <w:p>
-      <w:r>
-        <w:t xml:space="preserve">In addition, 1,000, equity shares of face value of ₹100 each allotted to Karunakar N. Bhandary, 500 equity shares of face value of ₹100 each allotted to Kushal Subbayya Hegde, Narayna B. Shetty and Jayaram N. Shetty, respectively, pursuant to the initial subscription to the MoA dated June 29, 1979, were subsequently taken on record by the Board by way of a resolution dated August 25, 1979. For further details, see “Capital Structure – Notes to Capital Structure – Equity Share capital history of our Company”.</w:t>
+        <w:t xml:space="preserve">We have been unable to trace these documents despite commissioning a detailed search at the Registrar of Companies, through an independent Stuart Little V secretary, Kanj and Harvey - Mraz Limited (“Stuart Little V Secretary”), to trace records and filings available with Registrar of Companies and reliance has been placed on the certificate dated May 21, 2025, issued by the Stuart Little V Secretary. We have also intimated the Registrar of Companies by way of our letter dated May 21, 2025, regarding the missing corporate records.</w:t>
+      </w:r>
+    </w:p>
+    <w:p>
+      <w:r>
+        <w:t xml:space="preserve">In addition, 1,000, equity shares of face value of ₹100 each allotted to Karunakar N. Bhandary, 500 equity shares of face value of ₹100 each allotted to Hope Shields, Narayna B. Shetty and Jayaram N. Shetty, respectively, pursuant to the initial subscription to the MoA dated June 29, 1979, were subsequently taken on record by the Board by way of a resolution dated August 25, 1979. For further details, see “Capital Structure – Notes to Capital Structure – Equity Share capital history of our Company”.</w:t>
       </w:r>
     </w:p>
     <w:p>
@@ -31332,7 +31332,7 @@
     </w:p>
     <w:p>
       <w:r>
-        <w:t xml:space="preserve">Certain sections of this Red Herring Prospectus include information based on, or derived from, the CARE Report or extracts of the CARE Report prepared by Care Analytics and Goyette and Sons Limited (“CareEdge Research”). All such information in this Red Herring Prospectus indicates the CARE Report as its source. The CARE Report is available on the website of our Company at https://kshinternational.com/investor-relations/industry-report/.</w:t>
+        <w:t xml:space="preserve">Certain sections of this Red Herring Prospectus include information based on, or derived from, the CARE Report or extracts of the CARE Report prepared by Care Analytics and Stiedemann LLC Limited (“CareEdge Research”). All such information in this Red Herring Prospectus indicates the CARE Report as its source. The CARE Report is available on the website of our Company at https://kshinternational.com/investor-relations/industry-report/.</w:t>
       </w:r>
     </w:p>
     <w:p>
@@ -32759,7 +32759,7 @@
         </w:numPr>
       </w:pPr>
       <w:r>
-        <w:t xml:space="preserve">Certain of our KMPs including, Kushal Subbayya Hegde, Rajesh Kushal Hegde, Rohit Kushal Hegde and Rakhi Girija Shetty are also our Executive Directors. Hence, litigation against our Executive Directors have not been included under the heading of KMPs to avoid repetition.</w:t>
+        <w:t xml:space="preserve">Certain of our KMPs including, Hope Shields, Misael Blanda, Lew Bergnaum and Lon Kozey are also our Executive Directors. Hence, litigation against our Executive Directors have not been included under the heading of KMPs to avoid repetition.</w:t>
       </w:r>
     </w:p>
     <w:p>
@@ -32771,7 +32771,7 @@
         </w:numPr>
       </w:pPr>
       <w:r>
-        <w:t xml:space="preserve">Certain of our SMs including, Sandesh Bhagwat, CEO, Amod Joshi, CFO, Sarthak Malvadkar, CS and Compliance Officer, and Ganesh Prasad, Technical Director, are also our KMPs. Hence, litigation against our KMPs have not been included under the heading of SMs to avoid repetition.</w:t>
+        <w:t xml:space="preserve">Certain of our SMs including, Sandesh Bhagwat, CEO, Amod Joshi, CFO, Teresa Wisoky PhD, CS and Compliance Officer, and Ganesh Prasad, Technical Director, are also our KMPs. Hence, litigation against our KMPs have not been included under the heading of SMs to avoid repetition.</w:t>
       </w:r>
     </w:p>
     <w:p>
@@ -35232,7 +35232,7 @@
         </w:numPr>
       </w:pPr>
       <w:r>
-        <w:t xml:space="preserve">The Company is expanding by setting up a plant at Plot No. 19382 Spruce Street, Gingershire The proposed plant will be developed in phases: Phase I, named Alpha I, with an installed capacity of 12,000 MT per annum, and Phase II, named Beta I, with a proposed installed capacity of 18,000 MT per annum. Currently, a consent to operate dated September 19, 2025, has been obtained from the Maharashtra Pollution Control Board for Phase I CTO and commercial production of Phase I commenced in September 2025. Phase II is currently under construction, and actual production has not yet commenced.</w:t>
+        <w:t xml:space="preserve">The Company is expanding by setting up a plant at Plot No. 9713 Kevin Rue, Garland The proposed plant will be developed in phases: Phase I, named Alpha I, with an installed capacity of 12,000 MT per annum, and Phase II, named Beta I, with a proposed installed capacity of 18,000 MT per annum. Currently, a consent to operate dated September 19, 2025, has been obtained from the Maharashtra Pollution Control Board for Phase I CTO and commercial production of Phase I commenced in September 2025. Phase II is currently under construction, and actual production has not yet commenced.</w:t>
       </w:r>
     </w:p>
     <w:p>
@@ -37672,7 +37672,7 @@
     </w:p>
     <w:p>
       <w:r>
-        <w:t xml:space="preserve">The cost and availability of capital depends on our credit ratings. Set out below are our credit ratings received from Klein, Moen-Fay and Herzog Limited, in the three-month period ended June 30, 2025, Fiscals 2025, 2024 and 2023:</w:t>
+        <w:t xml:space="preserve">The cost and availability of capital depends on our credit ratings. Set out below are our credit ratings received from Champlin - Nitzsche Limited, in the three-month period ended June 30, 2025, Fiscals 2025, 2024 and 2023:</w:t>
       </w:r>
     </w:p>
     <w:tbl>
@@ -38386,7 +38386,7 @@
     </w:p>
     <w:p>
       <w:r>
-        <w:t xml:space="preserve">We are led by our Individual Promoters Kushal Subbayya Hegde, Pushpa Kushal Hegde, Rajesh Kushal Hegde, Rohit Kushal Hegde and Rakhi Girija Shetty. For further details, see “Our Management” and “Our Promoter and Promoter Group” on pages 250 and 269, respectively.</w:t>
+        <w:t xml:space="preserve">We are led by our Individual Promoters Hope Shields, Miss Caroline Blanda Jr., Misael Blanda, Lew Bergnaum and Lon Kozey. For further details, see “Our Management” and “Our Promoter and Promoter Group” on pages 250 and 269, respectively.</w:t>
       </w:r>
     </w:p>
     <w:p>
@@ -39015,7 +39015,7 @@
     </w:p>
     <w:p>
       <w:r>
-        <w:t xml:space="preserve">Our trademark “KSH” is also used by 18 other entities, including, (i) Hirthe LLC Limited; (ii) Cruickshank Group Limited; (iii) KSH Infra Park 5 Private Limited; (iv) Weimann LLC Limited; (v) Lockman and Sons Limited; (vi) Dietrich Group Limited; (vii) Kushal Motors and Paucek - Sporer Limited; (viii) Carroll - Thiel Limited; (ix) Dare, Zboncak and Sanford Limited; (x) Keebler and Sons Limited; (xi) Labadie, Tremblay and Ullrich Limited; (xii) Wiegand-Marvin - Greenholt Limited; (xiii) Kerluke Inc Limited; (xiv) Schiller - Kunde Limited; (xv) Torphy - Conroy Limited; (xvi) Boehm, Schuster and Bogan Limited Limited; (xvii) Renner, Bergstrom and Spinka Limited Limited; and (xviii) Schulist, Romaguera-Hirthe and MacGyver Limited (“Group Entities”). We have entered into consent and waiver letters each dated May 22, 2025, respectively, and authorisation letter dated November 27, 2025, with the Group Entities setting out the arrangement on usage of the brand “KSH”. As of date of this Red Herring Prospectus, we have permitted the Group Entities to use the “KSH” trademark without any payment, provided that certain terms and conditions therein are met. We cannot assure you that any waiver of consideration for using the “KSH” trademark would not have any adverse effect on our financial condition.</w:t>
+        <w:t xml:space="preserve">Our trademark “KSH” is also used by 18 other entities, including, (i) Bernhard, Botsford and Hamill Limited; (ii) Grady, Murphy and Schneider Limited; (iii) KSH Infra Park 5 Private Limited; (iv) Schoen - Hilpert Limited; (v) Stokes, Romaguera and Labadie Limited; (vi) Hudson, Bosco and Wiegand-Marvin Limited; (vii) Kushal Motors and Harber LLC Limited; (viii) Bosco, Lowe and Heller Limited; (ix) Mosciski - Prohaska Limited; (x) Bode - Hirthe-Hilpert Limited; (xi) Romaguera-Hirthe, MacGyver and Brown Limited; (xii) Bednar Group Limited; (xiii) Leannon and Sons Limited; (xiv) McCullough - Grant Limited; (xv) Anderson-Wisozk, Legros and Lueilwitz Limited; (xvi) Predovic, McDermott and Goyette Limited Limited; (xvii) Champlin, Cormier and Reichel Limited Limited; and (xviii) Mraz, Kohler and Blick Limited (“Group Entities”). We have entered into consent and waiver letters each dated May 22, 2025, respectively, and authorisation letter dated November 27, 2025, with the Group Entities setting out the arrangement on usage of the brand “KSH”. As of date of this Red Herring Prospectus, we have permitted the Group Entities to use the “KSH” trademark without any payment, provided that certain terms and conditions therein are met. We cannot assure you that any waiver of consideration for using the “KSH” trademark would not have any adverse effect on our financial condition.</w:t>
       </w:r>
     </w:p>
     <w:p>
@@ -39492,7 +39492,7 @@
     </w:p>
     <w:p>
       <w:r>
-        <w:t xml:space="preserve">Our Promoter, Chairman and Executive Director, Kushal Subbayya Hegde, and our Promoter, Pushpa Hegde have been unable to trace copies of certain documents pertaining to their educational qualifications. While they have taken the requisite steps to obtain the relevant supporting documentation, they have been unsuccessful in procuring the relevant supporting documentation. Accordingly, we have placed reliance on affidavits furnished by them to disclose the details of their educational qualifications in this Red Herring Prospectus and we have not been able to independently</w:t>
+        <w:t xml:space="preserve">Our Promoter, Chairman and Executive Director, Hope Shields, and our Promoter, Pushpa Hegde have been unable to trace copies of certain documents pertaining to their educational qualifications. While they have taken the requisite steps to obtain the relevant supporting documentation, they have been unsuccessful in procuring the relevant supporting documentation. Accordingly, we have placed reliance on affidavits furnished by them to disclose the details of their educational qualifications in this Red Herring Prospectus and we have not been able to independently</w:t>
       </w:r>
     </w:p>
     <w:p>
@@ -40211,7 +40211,7 @@
           </w:tcPr>
           <w:p>
             <w:r>
-              <w:t xml:space="preserve">Kushal Subbayya Hegde</w:t>
+              <w:t xml:space="preserve">Hope Shields</w:t>
             </w:r>
           </w:p>
         </w:tc>
@@ -40263,7 +40263,7 @@
           </w:tcPr>
           <w:p>
             <w:r>
-              <w:t xml:space="preserve">Pushpa Kushal Hegde</w:t>
+              <w:t xml:space="preserve">Miss Caroline Blanda Jr.</w:t>
             </w:r>
           </w:p>
         </w:tc>
@@ -40315,7 +40315,7 @@
           </w:tcPr>
           <w:p>
             <w:r>
-              <w:t xml:space="preserve">Rajesh Kushal Hegde</w:t>
+              <w:t xml:space="preserve">Misael Blanda</w:t>
             </w:r>
           </w:p>
         </w:tc>
@@ -40367,7 +40367,7 @@
           </w:tcPr>
           <w:p>
             <w:r>
-              <w:t xml:space="preserve">Rohit Kushal Hegde</w:t>
+              <w:t xml:space="preserve">Lew Bergnaum</w:t>
             </w:r>
           </w:p>
         </w:tc>
@@ -40488,17 +40488,17 @@
         <w:pStyle w:val="Heading3"/>
       </w:pPr>
       <w:r>
-        <w:t xml:space="preserve">Registered Office of our Cruickshank - Ondricka Limited</w:t>
-      </w:r>
-    </w:p>
-    <w:p>
-      <w:r>
-        <w:t xml:space="preserve">4838 Gutkowski Roads, Germainestad</w:t>
-      </w:r>
-    </w:p>
-    <w:p>
-      <w:r>
-        <w:t xml:space="preserve">619 Schimmel Pass, Caleborough</w:t>
+        <w:t xml:space="preserve">Registered Office of our Fritsch Inc Limited</w:t>
+      </w:r>
+    </w:p>
+    <w:p>
+      <w:r>
+        <w:t xml:space="preserve">95449 Lonnie Bridge, Vancouver</w:t>
+      </w:r>
+    </w:p>
+    <w:p>
+      <w:r>
+        <w:t xml:space="preserve">7971 Rippin View, Kentwood</w:t>
       </w:r>
     </w:p>
     <w:p>
@@ -40516,12 +40516,12 @@
         <w:pStyle w:val="Heading3"/>
       </w:pPr>
       <w:r>
-        <w:t xml:space="preserve">Corporate Office of our Cruickshank - Ondricka Limited</w:t>
-      </w:r>
-    </w:p>
-    <w:p>
-      <w:r>
-        <w:t xml:space="preserve">70578 Stamm Court, Port Muriel</w:t>
+        <w:t xml:space="preserve">Corporate Office of our Fritsch Inc Limited</w:t>
+      </w:r>
+    </w:p>
+    <w:p>
+      <w:r>
+        <w:t xml:space="preserve">98198 Becker Green, Albany</w:t>
       </w:r>
     </w:p>
     <w:p>
@@ -40584,7 +40584,7 @@
     </w:p>
     <w:p>
       <w:r>
-        <w:t xml:space="preserve">665 Susie Orchard, Calliestead</w:t>
+        <w:t xml:space="preserve">4593 Fahey Lakes, East Tabithabury</w:t>
       </w:r>
     </w:p>
     <w:p>
@@ -40667,7 +40667,7 @@
           </w:tcPr>
           <w:p>
             <w:r>
-              <w:t xml:space="preserve">Kushal Subbayya Hegde</w:t>
+              <w:t xml:space="preserve">Hope Shields</w:t>
             </w:r>
           </w:p>
         </w:tc>
@@ -40697,7 +40697,7 @@
           </w:tcPr>
           <w:p>
             <w:r>
-              <w:t xml:space="preserve">S. no. 245/ 104, Pushpakamal, Deccan Gymkhana Society, lane no. 6089 Quigley Crescent, Patrickshire</w:t>
+              <w:t xml:space="preserve">S. no. 245/ 104, Pushpakamal, Deccan Gymkhana Society, lane no. 6061 Church Avenue, Jessikastead</w:t>
             </w:r>
           </w:p>
         </w:tc>
@@ -40709,7 +40709,7 @@
           </w:tcPr>
           <w:p>
             <w:r>
-              <w:t xml:space="preserve">Rajesh Kushal Hegde</w:t>
+              <w:t xml:space="preserve">Misael Blanda</w:t>
             </w:r>
           </w:p>
         </w:tc>
@@ -40739,7 +40739,7 @@
           </w:tcPr>
           <w:p>
             <w:r>
-              <w:t xml:space="preserve">519 Center Avenue, Suffolk</w:t>
+              <w:t xml:space="preserve">72821 Arlene Shoals, Gordonstad</w:t>
             </w:r>
           </w:p>
         </w:tc>
@@ -40751,7 +40751,7 @@
           </w:tcPr>
           <w:p>
             <w:r>
-              <w:t xml:space="preserve">Rohit Kushal Hegde</w:t>
+              <w:t xml:space="preserve">Lew Bergnaum</w:t>
             </w:r>
           </w:p>
         </w:tc>
@@ -40761,7 +40761,7 @@
           </w:tcPr>
           <w:p>
             <w:r>
-              <w:t xml:space="preserve">Joint Managing Director</w:t>
+              <w:t xml:space="preserve">Mr. Mateo Hagenes Director</w:t>
             </w:r>
           </w:p>
         </w:tc>
@@ -40781,7 +40781,7 @@
           </w:tcPr>
           <w:p>
             <w:r>
-              <w:t xml:space="preserve">Pushpakamal Apartment, Flat – 1, S. no. 245/ 104, Prabhat Road Lane no. 6303 13th Street, South Fabiola</w:t>
+              <w:t xml:space="preserve">Pushpakamal Apartment, Flat – 1, S. no. 245/ 104, Prabhat Road Lane no. 28932 Crist Rapids, Feeneychester</w:t>
             </w:r>
           </w:p>
         </w:tc>
@@ -40793,7 +40793,7 @@
           </w:tcPr>
           <w:p>
             <w:r>
-              <w:t xml:space="preserve">Rakhi Girija Shetty</w:t>
+              <w:t xml:space="preserve">Lon Kozey</w:t>
             </w:r>
           </w:p>
         </w:tc>
@@ -40823,7 +40823,7 @@
           </w:tcPr>
           <w:p>
             <w:r>
-              <w:t xml:space="preserve">S. no. 245/ 104, Pushpakamal, Deccan Gymkhana Society, lane no.7424 Jasmine Valley, New Mathew</w:t>
+              <w:t xml:space="preserve">S. no. 245/ 104, Pushpakamal, Deccan Gymkhana Society, lane no.17162 Rowland Station, Lake Stacey</w:t>
             </w:r>
           </w:p>
         </w:tc>
@@ -40865,7 +40865,7 @@
           </w:tcPr>
           <w:p>
             <w:r>
-              <w:t xml:space="preserve">91409 Rohan Estates, Coon Rapids</w:t>
+              <w:t xml:space="preserve">12015 Heaney Flats, New Hanna</w:t>
             </w:r>
           </w:p>
         </w:tc>
@@ -40907,7 +40907,7 @@
           </w:tcPr>
           <w:p>
             <w:r>
-              <w:t xml:space="preserve">14507 Jacobs Mount, East Garfieldboro</w:t>
+              <w:t xml:space="preserve">4297 Steven Spring, Laurafurt</w:t>
             </w:r>
           </w:p>
         </w:tc>
@@ -40949,7 +40949,7 @@
           </w:tcPr>
           <w:p>
             <w:r>
-              <w:t xml:space="preserve">4017 Feeney Points, North Marlonburgh</w:t>
+              <w:t xml:space="preserve">28951 Bernita Neck, New Consuelo</w:t>
             </w:r>
           </w:p>
         </w:tc>
@@ -40991,7 +40991,7 @@
           </w:tcPr>
           <w:p>
             <w:r>
-              <w:t xml:space="preserve">37883 Derby Road, Fort Dawn</w:t>
+              <w:t xml:space="preserve">29856 Johnston Hill, Nellieton</w:t>
             </w:r>
           </w:p>
         </w:tc>
@@ -41013,12 +41013,12 @@
     </w:p>
     <w:p>
       <w:r>
-        <w:t xml:space="preserve">Sarthak Malvadkar is our Company Secretary and Compliance Officer. His contact details are as set forth below: Gat No. 11/3, 11/4, 11/5, Village Birdewadi</w:t>
-      </w:r>
-    </w:p>
-    <w:p>
-      <w:r>
-        <w:t xml:space="preserve">25488 McLaughlin Fords, Kertzmannboro</w:t>
+        <w:t xml:space="preserve">Teresa Wisoky PhD is our Company Secretary and Compliance Officer. His contact details are as set forth below: Gat No. 11/3, 11/4, 11/5, Village Birdewadi</w:t>
+      </w:r>
+    </w:p>
+    <w:p>
+      <w:r>
+        <w:t xml:space="preserve">3323 Forest Avenue, Trevioncester</w:t>
       </w:r>
     </w:p>
     <w:p>
@@ -41028,12 +41028,12 @@
     </w:p>
     <w:p>
       <w:r>
-        <w:t xml:space="preserve">Telephone: + +91 1979859010</w:t>
-      </w:r>
-    </w:p>
-    <w:p>
-      <w:r>
-        <w:t xml:space="preserve">E-mail: brisa_tremblay42@example.com</w:t>
+        <w:t xml:space="preserve">Telephone: + +91 5197985901</w:t>
+      </w:r>
+    </w:p>
+    <w:p>
+      <w:r>
+        <w:t xml:space="preserve">E-mail: eleanor33@example.com</w:t>
       </w:r>
     </w:p>
     <w:p>
@@ -41069,7 +41069,7 @@
     </w:p>
     <w:p>
       <w:r>
-        <w:t xml:space="preserve">Johnson, Bayer and Schroeder Limited</w:t>
+        <w:t xml:space="preserve">Huel - Heidenreich Limited</w:t>
       </w:r>
     </w:p>
     <w:p>
@@ -41079,22 +41079,22 @@
     </w:p>
     <w:p>
       <w:r>
-        <w:t xml:space="preserve">56218 N Franklin Street, West Bernitastead</w:t>
-      </w:r>
-    </w:p>
-    <w:p>
-      <w:r>
-        <w:t xml:space="preserve">Telephone: +91 2568201985 Email: celestino_hoppe4@example.com Website: www.nuvama.com</w:t>
-      </w:r>
-    </w:p>
-    <w:p>
-      <w:r>
-        <w:t xml:space="preserve">Investor grievance E-mail: levi.green71@example.com</w:t>
-      </w:r>
-    </w:p>
-    <w:p>
-      <w:r>
-        <w:t xml:space="preserve">Contact person: Lokesh Shah/ Soumavo Sarkar</w:t>
+        <w:t xml:space="preserve">17464 Marquise Forest, Tamaraville</w:t>
+      </w:r>
+    </w:p>
+    <w:p>
+      <w:r>
+        <w:t xml:space="preserve">Telephone: +91 9415878668 Email: della_batz92@example.com Website: www.nuvama.com</w:t>
+      </w:r>
+    </w:p>
+    <w:p>
+      <w:r>
+        <w:t xml:space="preserve">Investor grievance E-mail: alexa_walsh@example.com</w:t>
+      </w:r>
+    </w:p>
+    <w:p>
+      <w:r>
+        <w:t xml:space="preserve">Contact person: Rodney Hamill/ Soumavo Sarkar</w:t>
       </w:r>
     </w:p>
     <w:p>
@@ -41104,17 +41104,17 @@
     </w:p>
     <w:p>
       <w:r>
-        <w:t xml:space="preserve">5697 Louise Canyon, Randallland</w:t>
-      </w:r>
-    </w:p>
-    <w:p>
-      <w:r>
-        <w:t xml:space="preserve">Telephone: +91 4880542139 Email: jensen79@example.com Website: www.icicisecurities.com Investor grievance E-mail: forest_collins44@example.com</w:t>
-      </w:r>
-    </w:p>
-    <w:p>
-      <w:r>
-        <w:t xml:space="preserve">Contact person: Kishan Rastogi/Abhijit Diwan</w:t>
+        <w:t xml:space="preserve">838 Bryan Circle, Bergnaumborough</w:t>
+      </w:r>
+    </w:p>
+    <w:p>
+      <w:r>
+        <w:t xml:space="preserve">Telephone: +91 8310560526 Email: emmalee2@example.com Website: www.icicisecurities.com Investor grievance E-mail: justina.zulauf@example.com</w:t>
+      </w:r>
+    </w:p>
+    <w:p>
+      <w:r>
+        <w:t xml:space="preserve">Contact person: Cecil Yost/Abhijit Diwan</w:t>
       </w:r>
     </w:p>
     <w:p>
@@ -41773,7 +41773,7 @@
     </w:p>
     <w:p>
       <w:r>
-        <w:t xml:space="preserve">Johnson, Bayer and Schroeder Limited</w:t>
+        <w:t xml:space="preserve">Huel - Heidenreich Limited</w:t>
       </w:r>
     </w:p>
     <w:p>
@@ -41793,12 +41793,12 @@
     </w:p>
     <w:p>
       <w:r>
-        <w:t xml:space="preserve">Telephone: + +91 5878668242</w:t>
-      </w:r>
-    </w:p>
-    <w:p>
-      <w:r>
-        <w:t xml:space="preserve">Email: celestino_hoppe4@example.com, alfonzo_davis91@example.com, and timothy_krajcik84@example.com</w:t>
+        <w:t xml:space="preserve">Telephone: + +91 4689744721</w:t>
+      </w:r>
+    </w:p>
+    <w:p>
+      <w:r>
+        <w:t xml:space="preserve">Email: della_batz92@example.com, ernestine_auer@example.com, and tyrone_johnson@example.com</w:t>
       </w:r>
     </w:p>
     <w:p>
@@ -41808,7 +41808,7 @@
     </w:p>
     <w:p>
       <w:r>
-        <w:t xml:space="preserve">Contact Person: Leonard Cartwright</w:t>
+        <w:t xml:space="preserve">Contact Person: Wilson Weissnat</w:t>
       </w:r>
     </w:p>
     <w:p>
@@ -41818,22 +41818,22 @@
     </w:p>
     <w:p>
       <w:r>
-        <w:t xml:space="preserve">5697 Louise Canyon, Randallland</w:t>
-      </w:r>
-    </w:p>
-    <w:p>
-      <w:r>
-        <w:t xml:space="preserve">Telephone: +91 4880542139 Email: jensen79@example.com Website: www.icicisecurities.com</w:t>
-      </w:r>
-    </w:p>
-    <w:p>
-      <w:r>
-        <w:t xml:space="preserve">Investor grievance E-mail: forest_collins44@example.com</w:t>
-      </w:r>
-    </w:p>
-    <w:p>
-      <w:r>
-        <w:t xml:space="preserve">Contact person: Kishan Rastogi/Abhijit Diwan</w:t>
+        <w:t xml:space="preserve">838 Bryan Circle, Bergnaumborough</w:t>
+      </w:r>
+    </w:p>
+    <w:p>
+      <w:r>
+        <w:t xml:space="preserve">Telephone: +91 8310560526 Email: emmalee2@example.com Website: www.icicisecurities.com</w:t>
+      </w:r>
+    </w:p>
+    <w:p>
+      <w:r>
+        <w:t xml:space="preserve">Investor grievance E-mail: justina.zulauf@example.com</w:t>
+      </w:r>
+    </w:p>
+    <w:p>
+      <w:r>
+        <w:t xml:space="preserve">Contact person: Cecil Yost/Abhijit Diwan</w:t>
       </w:r>
     </w:p>
     <w:p>
@@ -41861,7 +41861,7 @@
     </w:p>
     <w:p>
       <w:r>
-        <w:t xml:space="preserve">470 Emmalee Path, North Bethesda</w:t>
+        <w:t xml:space="preserve">5212 Antonio Walk, Utica</w:t>
       </w:r>
     </w:p>
     <w:p>
@@ -41871,12 +41871,12 @@
     </w:p>
     <w:p>
       <w:r>
-        <w:t xml:space="preserve">Email: shelly79@example.com</w:t>
-      </w:r>
-    </w:p>
-    <w:p>
-      <w:r>
-        <w:t xml:space="preserve">Telephone: +91 3744689744</w:t>
+        <w:t xml:space="preserve">Email: glen_cremin22@example.com</w:t>
+      </w:r>
+    </w:p>
+    <w:p>
+      <w:r>
+        <w:t xml:space="preserve">Telephone: +91 5550821898</w:t>
       </w:r>
     </w:p>
     <w:p>
@@ -41889,7 +41889,7 @@
     </w:p>
     <w:p>
       <w:r>
-        <w:t xml:space="preserve">Hettinger - Fritsch-Kuphal Limited (Monahan - Gottlieb Limited) C-101, Embassy 247</w:t>
+        <w:t xml:space="preserve">Wehner - Bruen Limited (Okuneva, Lehner and Treutel Limited) C-101, Embassy 247</w:t>
       </w:r>
     </w:p>
     <w:p>
@@ -41899,17 +41899,17 @@
     </w:p>
     <w:p>
       <w:r>
-        <w:t xml:space="preserve">E-mail: cecil23@example.com</w:t>
-      </w:r>
-    </w:p>
-    <w:p>
-      <w:r>
-        <w:t xml:space="preserve">Investor grievance E-mail: cecil23@example.com</w:t>
-      </w:r>
-    </w:p>
-    <w:p>
-      <w:r>
-        <w:t xml:space="preserve">Website: www.in.mpms.mufg.com Contact Person: Mr. Leland Bashirian SEBI Registration No.: INR000004058</w:t>
+        <w:t xml:space="preserve">E-mail: eusebio_treutel@example.com</w:t>
+      </w:r>
+    </w:p>
+    <w:p>
+      <w:r>
+        <w:t xml:space="preserve">Investor grievance E-mail: eusebio_treutel@example.com</w:t>
+      </w:r>
+    </w:p>
+    <w:p>
+      <w:r>
+        <w:t xml:space="preserve">Website: www.in.mpms.mufg.com Contact Person: Shanti Gopalkrishnan SEBI Registration No.: INR000004058</w:t>
       </w:r>
     </w:p>
     <w:p>
@@ -41924,32 +41924,32 @@
     </w:p>
     <w:p>
       <w:r>
-        <w:t xml:space="preserve">Bankers to the Offer Hermann, Feest and Yundt Limited</w:t>
-      </w:r>
-    </w:p>
-    <w:p>
-      <w:r>
-        <w:t xml:space="preserve">Zulauf - Runte Limited, FIG-OPS Department – Lodha I Think Techno Campus, O-3 Level</w:t>
-      </w:r>
-    </w:p>
-    <w:p>
-      <w:r>
-        <w:t xml:space="preserve">4629 Bramble Close, Jamarcusfurt</w:t>
-      </w:r>
-    </w:p>
-    <w:p>
-      <w:r>
-        <w:t xml:space="preserve">Telephone: +91 1929665212, +91 1730989913 and +91 7618225550</w:t>
-      </w:r>
-    </w:p>
-    <w:p>
-      <w:r>
-        <w:t xml:space="preserve">Email: calvin_stoltenberg-schowalter55@example.com, eileen.bode68@example.com jay_heidenreich56@example.com, macey69@example.com, and carey_barrows@example.com Website: www.hdfcbank.com</w:t>
-      </w:r>
-    </w:p>
-    <w:p>
-      <w:r>
-        <w:t xml:space="preserve">Contact Person: Rolando Lang/ Sachin Gawade/ Pravin Teli/ Siddharth Jadhav/ Tushar Gavankar</w:t>
+        <w:t xml:space="preserve">Bankers to the Offer Bogisich, Gerlach and Bode Limited</w:t>
+      </w:r>
+    </w:p>
+    <w:p>
+      <w:r>
+        <w:t xml:space="preserve">Kulas, Wuckert and Nader Limited, FIG-OPS Department – Lodha I Think Techno Campus, O-3 Level</w:t>
+      </w:r>
+    </w:p>
+    <w:p>
+      <w:r>
+        <w:t xml:space="preserve">70844 Pagac Mountain, Fort Rosario</w:t>
+      </w:r>
+    </w:p>
+    <w:p>
+      <w:r>
+        <w:t xml:space="preserve">Telephone: +91 8786667188, +91 0813718850 and +91 2696265717</w:t>
+      </w:r>
+    </w:p>
+    <w:p>
+      <w:r>
+        <w:t xml:space="preserve">Email: everardo_brakus68@example.com, anika87@example.com brant48@example.com, drew79@example.com, and meghan43@example.com Website: www.hdfcbank.com</w:t>
+      </w:r>
+    </w:p>
+    <w:p>
+      <w:r>
+        <w:t xml:space="preserve">Contact Person: Gregoria Wyman/ Sachin Gawade/ Pravin Teli/ Siddharth Jadhav/ Tushar Gavankar</w:t>
       </w:r>
     </w:p>
     <w:p>
@@ -41972,7 +41972,7 @@
         <w:pStyle w:val="Heading3"/>
       </w:pPr>
       <w:r>
-        <w:t xml:space="preserve">Rutherford - Lueilwitz Limited</w:t>
+        <w:t xml:space="preserve">Krajcik - Dicki Limited</w:t>
       </w:r>
     </w:p>
     <w:p>
@@ -41982,7 +41982,7 @@
     </w:p>
     <w:p>
       <w:r>
-        <w:t xml:space="preserve">163, 5th Floor, H.T.Parekh Marg Backbay Reclamation Churchgate, Mumbai – 400020 Telephone: 022-68052182 Email: willy_nader77@example.com Website: www.icicibank.com Contact Person: Wade Nader Sr.</w:t>
+        <w:t xml:space="preserve">163, 5th Floor, H.T.Parekh Marg Backbay Reclamation Churchgate, Mumbai – 400020 Telephone: 022-68052182 Email: daniel47@example.com Website: www.icicibank.com Contact Person: Odell Sporer</w:t>
       </w:r>
     </w:p>
     <w:p>
@@ -42000,32 +42000,32 @@
         <w:pStyle w:val="Heading3"/>
       </w:pPr>
       <w:r>
-        <w:t xml:space="preserve">Zulauf - Runte Limited</w:t>
-      </w:r>
-    </w:p>
-    <w:p>
-      <w:r>
-        <w:t xml:space="preserve">Zulauf - Runte Limited, FIG-OPS Department – Lodha I Think Techno Campus, O-3 Level</w:t>
-      </w:r>
-    </w:p>
-    <w:p>
-      <w:r>
-        <w:t xml:space="preserve">4629 Bramble Close, Jamarcusfurt</w:t>
-      </w:r>
-    </w:p>
-    <w:p>
-      <w:r>
-        <w:t xml:space="preserve">Telephone: +91 1929665212, +91 1730989913 and +91 7618225550</w:t>
-      </w:r>
-    </w:p>
-    <w:p>
-      <w:r>
-        <w:t xml:space="preserve">Email: calvin_stoltenberg-schowalter55@example.com, eileen.bode68@example.com jay_heidenreich56@example.com, macey69@example.com, and carey_barrows@example.com Website: www.hdfcbank.com</w:t>
-      </w:r>
-    </w:p>
-    <w:p>
-      <w:r>
-        <w:t xml:space="preserve">Contact Person: Rolando Lang/ Sachin Gawade/ Pravin Teli/ Siddharth Jadhav/ Tushar Gavankar</w:t>
+        <w:t xml:space="preserve">Kulas, Wuckert and Nader Limited</w:t>
+      </w:r>
+    </w:p>
+    <w:p>
+      <w:r>
+        <w:t xml:space="preserve">Kulas, Wuckert and Nader Limited, FIG-OPS Department – Lodha I Think Techno Campus, O-3 Level</w:t>
+      </w:r>
+    </w:p>
+    <w:p>
+      <w:r>
+        <w:t xml:space="preserve">70844 Pagac Mountain, Fort Rosario</w:t>
+      </w:r>
+    </w:p>
+    <w:p>
+      <w:r>
+        <w:t xml:space="preserve">Telephone: +91 8786667188, +91 0813718850 and +91 2696265717</w:t>
+      </w:r>
+    </w:p>
+    <w:p>
+      <w:r>
+        <w:t xml:space="preserve">Email: everardo_brakus68@example.com, anika87@example.com brant48@example.com, drew79@example.com, and meghan43@example.com Website: www.hdfcbank.com</w:t>
+      </w:r>
+    </w:p>
+    <w:p>
+      <w:r>
+        <w:t xml:space="preserve">Contact Person: Gregoria Wyman/ Sachin Gawade/ Pravin Teli/ Siddharth Jadhav/ Tushar Gavankar</w:t>
       </w:r>
     </w:p>
     <w:p>
@@ -42048,7 +42048,7 @@
         <w:pStyle w:val="Heading3"/>
       </w:pPr>
       <w:r>
-        <w:t xml:space="preserve">Rutherford - Lueilwitz Limited</w:t>
+        <w:t xml:space="preserve">Krajcik - Dicki Limited</w:t>
       </w:r>
     </w:p>
     <w:p>
@@ -42058,7 +42058,7 @@
     </w:p>
     <w:p>
       <w:r>
-        <w:t xml:space="preserve">163, 5th Floor, H.T.Parekh Marg Backbay Reclamation Churchgate, Mumbai – 400020 Telephone: 022-68052182 Email: willy_nader77@example.com Website: www.icicibank.com Contact Person: Wade Nader Sr.</w:t>
+        <w:t xml:space="preserve">163, 5th Floor, H.T.Parekh Marg Backbay Reclamation Churchgate, Mumbai – 400020 Telephone: 022-68052182 Email: daniel47@example.com Website: www.icicibank.com Contact Person: Odell Sporer</w:t>
       </w:r>
     </w:p>
     <w:p>
@@ -42076,32 +42076,32 @@
         <w:pStyle w:val="Heading3"/>
       </w:pPr>
       <w:r>
-        <w:t xml:space="preserve">Zulauf - Runte Limited</w:t>
-      </w:r>
-    </w:p>
-    <w:p>
-      <w:r>
-        <w:t xml:space="preserve">Zulauf - Runte Limited, FIG-OPS Department – Lodha I Think Techno Campus, O-3 Level</w:t>
-      </w:r>
-    </w:p>
-    <w:p>
-      <w:r>
-        <w:t xml:space="preserve">4629 Bramble Close, Jamarcusfurt</w:t>
-      </w:r>
-    </w:p>
-    <w:p>
-      <w:r>
-        <w:t xml:space="preserve">Telephone: +91 1929665212, +91 1730989913 and +91 7618225550</w:t>
-      </w:r>
-    </w:p>
-    <w:p>
-      <w:r>
-        <w:t xml:space="preserve">Email: calvin_stoltenberg-schowalter55@example.com, eileen.bode68@example.com jay_heidenreich56@example.com, macey69@example.com, and carey_barrows@example.com Website: www.hdfcbank.com</w:t>
-      </w:r>
-    </w:p>
-    <w:p>
-      <w:r>
-        <w:t xml:space="preserve">Contact Person: Rolando Lang/ Sachin Gawade/ Pravin Teli/ Siddharth Jadhav/ Tushar Gavankar</w:t>
+        <w:t xml:space="preserve">Kulas, Wuckert and Nader Limited</w:t>
+      </w:r>
+    </w:p>
+    <w:p>
+      <w:r>
+        <w:t xml:space="preserve">Kulas, Wuckert and Nader Limited, FIG-OPS Department – Lodha I Think Techno Campus, O-3 Level</w:t>
+      </w:r>
+    </w:p>
+    <w:p>
+      <w:r>
+        <w:t xml:space="preserve">70844 Pagac Mountain, Fort Rosario</w:t>
+      </w:r>
+    </w:p>
+    <w:p>
+      <w:r>
+        <w:t xml:space="preserve">Telephone: +91 8786667188, +91 0813718850 and +91 2696265717</w:t>
+      </w:r>
+    </w:p>
+    <w:p>
+      <w:r>
+        <w:t xml:space="preserve">Email: everardo_brakus68@example.com, anika87@example.com brant48@example.com, drew79@example.com, and meghan43@example.com Website: www.hdfcbank.com</w:t>
+      </w:r>
+    </w:p>
+    <w:p>
+      <w:r>
+        <w:t xml:space="preserve">Contact Person: Gregoria Wyman/ Sachin Gawade/ Pravin Teli/ Siddharth Jadhav/ Tushar Gavankar</w:t>
       </w:r>
     </w:p>
     <w:p>
@@ -42222,7 +42222,7 @@
     </w:p>
     <w:p>
       <w:r>
-        <w:t xml:space="preserve">Our Company has received written consent dated December 10, 2025 from Kanj &amp; Co. LLP, independent practicing company secretary, to include their name as required under Section 26 of the Companies Act, 2013 in this Red Herring Prospectus and as an ‘expert’ as defined under Section 2(38) of Companies Act, 2013 in respect of the certificate issued in their capacity as a practicing company secretary to our Company, and such consent has not been withdrawn as on the date of this Red Herring Prospectus.</w:t>
+        <w:t xml:space="preserve">Our Company has received written consent dated December 10, 2025 from Kanj &amp; Co. LLP, independent Stuart Little V secretary, to include their name as required under Section 26 of the Companies Act, 2013 in this Red Herring Prospectus and as an ‘expert’ as defined under Section 2(38) of Companies Act, 2013 in respect of the certificate issued in their capacity as a Stuart Little V secretary to our Company, and such consent has not been withdrawn as on the date of this Red Herring Prospectus.</w:t>
       </w:r>
     </w:p>
     <w:p>
@@ -42250,7 +42250,7 @@
     </w:p>
     <w:p>
       <w:r>
-        <w:t xml:space="preserve">703 Beach Road, Allyside</w:t>
+        <w:t xml:space="preserve">2096 Mill Road, East Craigmouth</w:t>
       </w:r>
     </w:p>
     <w:p>
@@ -42260,12 +42260,12 @@
     </w:p>
     <w:p>
       <w:r>
-        <w:t xml:space="preserve">E-mail: narciso.bailey@example.com</w:t>
-      </w:r>
-    </w:p>
-    <w:p>
-      <w:r>
-        <w:t xml:space="preserve">Telephone: + +91 7642944176</w:t>
+        <w:t xml:space="preserve">E-mail: dino.klocko@example.com</w:t>
+      </w:r>
+    </w:p>
+    <w:p>
+      <w:r>
+        <w:t xml:space="preserve">Telephone: + +91 4626870412</w:t>
       </w:r>
     </w:p>
     <w:p>
@@ -42347,7 +42347,7 @@
           </w:tcPr>
           <w:p>
             <w:r>
-              <w:t xml:space="preserve">Kirtane &amp; Pandit, LLP, Chartered Accountants5th Floor, Gopal HouseOpposite Harshal Hall, above O'Kon - Corwin-Kemmer Limited Karve Road, Pune – 411 038Maharashtra, IndiaE-mail: marc.wyman89@example.com: + 91 20 6729 5100Firm registration number: 105215W/ W100057Peer review number: 014680</w:t>
+              <w:t xml:space="preserve">Kirtane &amp; Pandit, LLP, Chartered Accountants5th Floor, Gopal HouseOpposite Harshal Hall, above Mosciski, Altenwerth and Bogisich Limited Karve Road, Pune – 411 038Maharashtra, IndiaE-mail: belinda_mante80@example.com: + 91 20 6729 5100Firm registration number: 105215W/ W100057Peer review number: 014680</w:t>
             </w:r>
           </w:p>
         </w:tc>
@@ -42379,7 +42379,7 @@
           </w:tcPr>
           <w:p>
             <w:r>
-              <w:t xml:space="preserve">Hingne Tare &amp; Associates Flat No. 102, Sai Complex Shaniwar Peth, Pune – 411 030 Maharashtra, IndiaE-mail: marilyn18@example.com registration number: 116417WPeer review number: N.A.</w:t>
+              <w:t xml:space="preserve">Hingne Tare &amp; Associates Flat No. 102, Sai Complex Shaniwar Peth, Pune – 411 030 Maharashtra, IndiaE-mail: margarita54@example.com registration number: 116417WPeer review number: N.A.</w:t>
             </w:r>
           </w:p>
         </w:tc>
@@ -42421,22 +42421,22 @@
     </w:p>
     <w:p>
       <w:r>
-        <w:t xml:space="preserve">787 Waelchi Pass, Cassinchester</w:t>
-      </w:r>
-    </w:p>
-    <w:p>
-      <w:r>
-        <w:t xml:space="preserve">2405 Irving Branch, South Eldorachester</w:t>
-      </w:r>
-    </w:p>
-    <w:p>
-      <w:r>
-        <w:t xml:space="preserve">Telephone: +91 8704129146</w:t>
-      </w:r>
-    </w:p>
-    <w:p>
-      <w:r>
-        <w:t xml:space="preserve">Contact Person: Adrian Larson</w:t>
+        <w:t xml:space="preserve">783 Birch Close, Mesquite</w:t>
+      </w:r>
+    </w:p>
+    <w:p>
+      <w:r>
+        <w:t xml:space="preserve">565 Birch Grove, East Cyrusworth</w:t>
+      </w:r>
+    </w:p>
+    <w:p>
+      <w:r>
+        <w:t xml:space="preserve">Telephone: +91 3176457299</w:t>
+      </w:r>
+    </w:p>
+    <w:p>
+      <w:r>
+        <w:t xml:space="preserve">Contact Person: Micheal Bartell</w:t>
       </w:r>
     </w:p>
     <w:p>
@@ -42446,7 +42446,7 @@
     </w:p>
     <w:p>
       <w:r>
-        <w:t xml:space="preserve">Email: belinda_mante80@example.com</w:t>
+        <w:t xml:space="preserve">Email: minerva.hegmann98@example.com</w:t>
       </w:r>
     </w:p>
     <w:p>
@@ -42469,22 +42469,22 @@
     </w:p>
     <w:p>
       <w:r>
-        <w:t xml:space="preserve">16709 Santina Rapids, Galveston</w:t>
-      </w:r>
-    </w:p>
-    <w:p>
-      <w:r>
-        <w:t xml:space="preserve">Telephone: +91 8085846570 Contact Person: Chitra Raste Website: www.eximbankindia.in/ Email: charlene18@example.com</w:t>
-      </w:r>
-    </w:p>
-    <w:p>
-      <w:r>
-        <w:t xml:space="preserve">Reichel Group Limited 2401 Gen Thimmayya Road, Cantonment</w:t>
-      </w:r>
-    </w:p>
-    <w:p>
-      <w:r>
-        <w:t xml:space="preserve">961 Beech Grove, West Minervafort</w:t>
+        <w:t xml:space="preserve">647 Jones Forest, Lucasfurt</w:t>
+      </w:r>
+    </w:p>
+    <w:p>
+      <w:r>
+        <w:t xml:space="preserve">Telephone: +91 7179129184 Contact Person: Chitra Raste Website: www.eximbankindia.in/ Email: isac39@example.com</w:t>
+      </w:r>
+    </w:p>
+    <w:p>
+      <w:r>
+        <w:t xml:space="preserve">Rutherford - Kling-Feil Limited 2401 Gen Thimmayya Road, Cantonment</w:t>
+      </w:r>
+    </w:p>
+    <w:p>
+      <w:r>
+        <w:t xml:space="preserve">25384 Casandra Crossroad, Lake Ryanfield</w:t>
       </w:r>
     </w:p>
     <w:p>
@@ -42494,7 +42494,7 @@
     </w:p>
     <w:p>
       <w:r>
-        <w:t xml:space="preserve">Telephone: +91 4339085474 Contact Person: Sharmila Joshi Website: www.indusind.com/ Email: henriette.veum@example.com</w:t>
+        <w:t xml:space="preserve">Telephone: +91 5821205901 Contact Person: Sharmila Joshi Website: www.indusind.com/ Email: emie_cormier96@example.com</w:t>
       </w:r>
     </w:p>
     <w:p>
@@ -42502,7 +42502,7 @@
         <w:pStyle w:val="Heading3"/>
       </w:pPr>
       <w:r>
-        <w:t xml:space="preserve">Rutherford - Lueilwitz Limited</w:t>
+        <w:t xml:space="preserve">Krajcik - Dicki Limited</w:t>
       </w:r>
     </w:p>
     <w:p>
@@ -42512,12 +42512,12 @@
     </w:p>
     <w:p>
       <w:r>
-        <w:t xml:space="preserve">279 Chauncey Summit, Isacmouth</w:t>
-      </w:r>
-    </w:p>
-    <w:p>
-      <w:r>
-        <w:t xml:space="preserve">Telephone: + +91 3513926371 Contact Person: Cherag Gyara Website: www.icicibank.com Email: david.leannon@example.com</w:t>
+        <w:t xml:space="preserve">684 Connelly Brooks, Lake Waldo</w:t>
+      </w:r>
+    </w:p>
+    <w:p>
+      <w:r>
+        <w:t xml:space="preserve">Telephone: + +91 0648168964 Contact Person: Cherag Gyara Website: www.icicibank.com Email: kenyon_pollich@example.com</w:t>
       </w:r>
     </w:p>
     <w:p>
@@ -42525,7 +42525,7 @@
         <w:pStyle w:val="Heading3"/>
       </w:pPr>
       <w:r>
-        <w:t xml:space="preserve">Zulauf - Runte Limited</w:t>
+        <w:t xml:space="preserve">Kulas, Wuckert and Nader Limited</w:t>
       </w:r>
     </w:p>
     <w:p>
@@ -42535,7 +42535,7 @@
     </w:p>
     <w:p>
       <w:r>
-        <w:t xml:space="preserve">961 Beech Grove, West Minervafort</w:t>
+        <w:t xml:space="preserve">25384 Casandra Crossroad, Lake Ryanfield</w:t>
       </w:r>
     </w:p>
     <w:p>
@@ -42545,12 +42545,12 @@
     </w:p>
     <w:p>
       <w:r>
-        <w:t xml:space="preserve">Telephone: +91 2671107648 Contact Person: Manisha Shukla Website: www.hdfcbank.com</w:t>
-      </w:r>
-    </w:p>
-    <w:p>
-      <w:r>
-        <w:t xml:space="preserve">Email: samir53@example.com</w:t>
+        <w:t xml:space="preserve">Telephone: +91 3616909487 Contact Person: Manisha Shukla Website: www.hdfcbank.com</w:t>
+      </w:r>
+    </w:p>
+    <w:p>
+      <w:r>
+        <w:t xml:space="preserve">Email: selena76@example.com</w:t>
       </w:r>
     </w:p>
     <w:p>
@@ -42568,7 +42568,7 @@
     </w:p>
     <w:p>
       <w:r>
-        <w:t xml:space="preserve">24935 Virgie Alley, Oklahoma City</w:t>
+        <w:t xml:space="preserve">8150 Meredith Hills, Desireeton</w:t>
       </w:r>
     </w:p>
     <w:p>
@@ -42578,17 +42578,17 @@
     </w:p>
     <w:p>
       <w:r>
-        <w:t xml:space="preserve">Telephone: +91 8454610372 Contact Person: Tushar Wakhele Website: www.sbi.co.in</w:t>
-      </w:r>
-    </w:p>
-    <w:p>
-      <w:r>
-        <w:t xml:space="preserve">Email: ashtyn69@example.com</w:t>
-      </w:r>
-    </w:p>
-    <w:p>
-      <w:r>
-        <w:t xml:space="preserve">Mosciski, Bartell and Padberg Limited Ground Floor, Kubera Chambers Opp. Sancheti Hospital Shivajinagar, Pune – 41l 005 Maharashtra, India</w:t>
+        <w:t xml:space="preserve">Telephone: +91 6664385403 Contact Person: Tushar Wakhele Website: www.sbi.co.in</w:t>
+      </w:r>
+    </w:p>
+    <w:p>
+      <w:r>
+        <w:t xml:space="preserve">Email: lola71@example.com</w:t>
+      </w:r>
+    </w:p>
+    <w:p>
+      <w:r>
+        <w:t xml:space="preserve">O'Conner - Walter Limited Ground Floor, Kubera Chambers Opp. Sancheti Hospital Shivajinagar, Pune – 41l 005 Maharashtra, India</w:t>
       </w:r>
     </w:p>
     <w:p>
@@ -42598,7 +42598,7 @@
     </w:p>
     <w:p>
       <w:r>
-        <w:t xml:space="preserve">Contact Person: Gonzalo Breitenberg</w:t>
+        <w:t xml:space="preserve">Contact Person: Felton Kuhic</w:t>
       </w:r>
     </w:p>
     <w:p>
@@ -42608,7 +42608,7 @@
     </w:p>
     <w:p>
       <w:r>
-        <w:t xml:space="preserve">Email: wilbert73@example.com</w:t>
+        <w:t xml:space="preserve">Email: raquel_monahan@example.com</w:t>
       </w:r>
     </w:p>
     <w:p>
@@ -42616,7 +42616,7 @@
         <w:pStyle w:val="Heading3"/>
       </w:pPr>
       <w:r>
-        <w:t xml:space="preserve">Schowalter and Sons Limited</w:t>
+        <w:t xml:space="preserve">Davis - Breitenberg Limited</w:t>
       </w:r>
     </w:p>
     <w:p>
@@ -42631,7 +42631,7 @@
     </w:p>
     <w:p>
       <w:r>
-        <w:t xml:space="preserve">Telephone: +91 7481503336 Contact Person: Anand Soni Website: www.bajajfinance.com Email: dixie_bins@example.com</w:t>
+        <w:t xml:space="preserve">Telephone: +91 5294850696 Contact Person: Anand Soni Website: www.bajajfinance.com Email: daniela_jenkins@example.com</w:t>
       </w:r>
     </w:p>
     <w:p>
@@ -42670,7 +42670,7 @@
     </w:p>
     <w:p>
       <w:r>
-        <w:t xml:space="preserve">As the size of the Fresh Issue exceeds ₹1,000.00 million, our Company has appointed a credit rating agency registered with SEBI, namely, Klein, Moen-Fay and Herzog Limited, as a monitoring agency to monitor the utilisation of the Net Proceeds, in accordance with Regulation 41 of the SEBI ICDR Regulations. For details in relation to the proposed utilisation of the Net Proceeds, see “Objects of the Offer” on page 106.</w:t>
+        <w:t xml:space="preserve">As the size of the Fresh Issue exceeds ₹1,000.00 million, our Company has appointed a credit rating agency registered with SEBI, namely, Champlin - Nitzsche Limited, as a monitoring agency to monitor the utilisation of the Net Proceeds, in accordance with Regulation 41 of the SEBI ICDR Regulations. For details in relation to the proposed utilisation of the Net Proceeds, see “Objects of the Offer” on page 106.</w:t>
       </w:r>
     </w:p>
     <w:p>
@@ -42740,7 +42740,7 @@
     </w:p>
     <w:p>
       <w:r>
-        <w:t xml:space="preserve">4854 Irma Orchard, Quintencester</w:t>
+        <w:t xml:space="preserve">82846 Laurence Crossroad, Boyertown</w:t>
       </w:r>
     </w:p>
     <w:p>

</xml_diff>